<commit_message>
Messaging, signature, auto-replies, attachments
</commit_message>
<xml_diff>
--- a/cx360/docs/CX360-User-Manual.docx
+++ b/cx360/docs/CX360-User-Manual.docx
@@ -855,7 +855,7 @@
           <w:bCs/>
           <w:b/>
         </w:rPr>
-        <w:t xml:space="preserve">Reply rules by channel</w:t>
+        <w:t xml:space="preserve">Flags, colours and read / unread</w:t>
       </w:r>
     </w:p>
     <w:tbl>
@@ -881,139 +881,369 @@
               <w:jc w:val="left"/>
             </w:pPr>
             <w:r>
-              <w:t xml:space="preserve">Channel</w:t>
-            </w:r>
-          </w:p>
-        </w:tc>
-        <w:tc>
-          <w:tcPr/>
-          <w:p>
-            <w:pPr>
-              <w:pStyle w:val="Compact"/>
-              <w:jc w:val="left"/>
-            </w:pPr>
-            <w:r>
-              <w:t xml:space="preserve">Rule</w:t>
-            </w:r>
-          </w:p>
-        </w:tc>
-      </w:tr>
-      <w:tr>
-        <w:tc>
-          <w:tcPr/>
-          <w:p>
-            <w:pPr>
-              <w:pStyle w:val="Compact"/>
-              <w:jc w:val="left"/>
-            </w:pPr>
-            <w:r>
-              <w:t xml:space="preserve">WhatsApp, Instagram, Messenger</w:t>
-            </w:r>
-          </w:p>
-        </w:tc>
-        <w:tc>
-          <w:tcPr/>
-          <w:p>
-            <w:pPr>
-              <w:pStyle w:val="Compact"/>
-              <w:jc w:val="left"/>
-            </w:pPr>
-            <w:r>
-              <w:t xml:space="preserve">You can reply only within</w:t>
-            </w:r>
-            <w:r>
-              <w:t xml:space="preserve"> </w:t>
-            </w:r>
+              <w:t xml:space="preserve">Tool</w:t>
+            </w:r>
+          </w:p>
+        </w:tc>
+        <w:tc>
+          <w:tcPr/>
+          <w:p>
+            <w:pPr>
+              <w:pStyle w:val="Compact"/>
+              <w:jc w:val="left"/>
+            </w:pPr>
+            <w:r>
+              <w:t xml:space="preserve">What it does</w:t>
+            </w:r>
+          </w:p>
+        </w:tc>
+      </w:tr>
+      <w:tr>
+        <w:tc>
+          <w:tcPr/>
+          <w:p>
+            <w:pPr>
+              <w:pStyle w:val="Compact"/>
+              <w:jc w:val="left"/>
+            </w:pPr>
             <w:r>
               <w:rPr>
                 <w:bCs/>
                 <w:b/>
               </w:rPr>
-              <w:t xml:space="preserve">24 hours</w:t>
+              <w:t xml:space="preserve">Unread dot and bold name</w:t>
+            </w:r>
+          </w:p>
+        </w:tc>
+        <w:tc>
+          <w:tcPr/>
+          <w:p>
+            <w:pPr>
+              <w:pStyle w:val="Compact"/>
+              <w:jc w:val="left"/>
+            </w:pPr>
+            <w:r>
+              <w:t xml:space="preserve">A new message is unread until someone opens it. Opening it marks it read.</w:t>
+            </w:r>
+          </w:p>
+        </w:tc>
+      </w:tr>
+      <w:tr>
+        <w:tc>
+          <w:tcPr/>
+          <w:p>
+            <w:pPr>
+              <w:pStyle w:val="Compact"/>
+              <w:jc w:val="left"/>
+            </w:pPr>
+            <w:r>
+              <w:rPr>
+                <w:bCs/>
+                <w:b/>
+              </w:rPr>
+              <w:t xml:space="preserve">Mark unread / Mark read</w:t>
+            </w:r>
+          </w:p>
+        </w:tc>
+        <w:tc>
+          <w:tcPr/>
+          <w:p>
+            <w:pPr>
+              <w:pStyle w:val="Compact"/>
+              <w:jc w:val="left"/>
+            </w:pPr>
+            <w:r>
+              <w:t xml:space="preserve">Button above the message (or press</w:t>
             </w:r>
             <w:r>
               <w:t xml:space="preserve"> </w:t>
             </w:r>
             <w:r>
-              <w:t xml:space="preserve">of the customer’s last message. After that CX360 tells you the window is closed.</w:t>
-            </w:r>
-          </w:p>
-        </w:tc>
-      </w:tr>
-      <w:tr>
-        <w:tc>
-          <w:tcPr/>
-          <w:p>
-            <w:pPr>
-              <w:pStyle w:val="Compact"/>
-              <w:jc w:val="left"/>
-            </w:pPr>
-            <w:r>
-              <w:t xml:space="preserve">X</w:t>
-            </w:r>
-          </w:p>
-        </w:tc>
-        <w:tc>
-          <w:tcPr/>
-          <w:p>
-            <w:pPr>
-              <w:pStyle w:val="Compact"/>
-              <w:jc w:val="left"/>
-            </w:pPr>
-            <w:r>
-              <w:t xml:space="preserve">Replies are sent; each one may carry a small cost, so keep them short.</w:t>
-            </w:r>
-          </w:p>
-        </w:tc>
-      </w:tr>
-      <w:tr>
-        <w:tc>
-          <w:tcPr/>
-          <w:p>
-            <w:pPr>
-              <w:pStyle w:val="Compact"/>
-              <w:jc w:val="left"/>
-            </w:pPr>
-            <w:r>
-              <w:t xml:space="preserve">Email, SMS</w:t>
-            </w:r>
-          </w:p>
-        </w:tc>
-        <w:tc>
-          <w:tcPr/>
-          <w:p>
-            <w:pPr>
-              <w:pStyle w:val="Compact"/>
-              <w:jc w:val="left"/>
-            </w:pPr>
-            <w:r>
-              <w:t xml:space="preserve">Sent normally.</w:t>
-            </w:r>
-          </w:p>
-        </w:tc>
-      </w:tr>
-      <w:tr>
-        <w:tc>
-          <w:tcPr/>
-          <w:p>
-            <w:pPr>
-              <w:pStyle w:val="Compact"/>
-              <w:jc w:val="left"/>
-            </w:pPr>
-            <w:r>
-              <w:t xml:space="preserve">Phone, chat, portal</w:t>
-            </w:r>
-          </w:p>
-        </w:tc>
-        <w:tc>
-          <w:tcPr/>
-          <w:p>
-            <w:pPr>
-              <w:pStyle w:val="Compact"/>
-              <w:jc w:val="left"/>
-            </w:pPr>
-            <w:r>
-              <w:t xml:space="preserve">Notes only. Nothing is sent to the customer.</w:t>
+              <w:rPr>
+                <w:rStyle w:val="VerbatimChar"/>
+              </w:rPr>
+              <w:t xml:space="preserve">u</w:t>
+            </w:r>
+            <w:r>
+              <w:t xml:space="preserve">). Use it to remind yourself or the team to come back to it.</w:t>
+            </w:r>
+          </w:p>
+        </w:tc>
+      </w:tr>
+      <w:tr>
+        <w:tc>
+          <w:tcPr/>
+          <w:p>
+            <w:pPr>
+              <w:pStyle w:val="Compact"/>
+              <w:jc w:val="left"/>
+            </w:pPr>
+            <w:r>
+              <w:rPr>
+                <w:bCs/>
+                <w:b/>
+              </w:rPr>
+              <w:t xml:space="preserve">Flag</w:t>
+            </w:r>
+          </w:p>
+        </w:tc>
+        <w:tc>
+          <w:tcPr/>
+          <w:p>
+            <w:pPr>
+              <w:pStyle w:val="Compact"/>
+              <w:jc w:val="left"/>
+            </w:pPr>
+            <w:r>
+              <w:t xml:space="preserve">Priority: Urgent (red), High (orange), Low (grey). Choose</w:t>
+            </w:r>
+            <w:r>
+              <w:t xml:space="preserve"> </w:t>
+            </w:r>
+            <w:r>
+              <w:t xml:space="preserve">“</w:t>
+            </w:r>
+            <w:r>
+              <w:t xml:space="preserve">Priority first</w:t>
+            </w:r>
+            <w:r>
+              <w:t xml:space="preserve">”</w:t>
+            </w:r>
+            <w:r>
+              <w:t xml:space="preserve"> </w:t>
+            </w:r>
+            <w:r>
+              <w:t xml:space="preserve">in the sort list to put urgent messages on top. Press</w:t>
+            </w:r>
+            <w:r>
+              <w:t xml:space="preserve"> </w:t>
+            </w:r>
+            <w:r>
+              <w:rPr>
+                <w:rStyle w:val="VerbatimChar"/>
+              </w:rPr>
+              <w:t xml:space="preserve">f</w:t>
+            </w:r>
+            <w:r>
+              <w:t xml:space="preserve"> </w:t>
+            </w:r>
+            <w:r>
+              <w:t xml:space="preserve">to cycle the flag.</w:t>
+            </w:r>
+          </w:p>
+        </w:tc>
+      </w:tr>
+      <w:tr>
+        <w:tc>
+          <w:tcPr/>
+          <w:p>
+            <w:pPr>
+              <w:pStyle w:val="Compact"/>
+              <w:jc w:val="left"/>
+            </w:pPr>
+            <w:r>
+              <w:rPr>
+                <w:bCs/>
+                <w:b/>
+              </w:rPr>
+              <w:t xml:space="preserve">Team code</w:t>
+            </w:r>
+          </w:p>
+        </w:tc>
+        <w:tc>
+          <w:tcPr/>
+          <w:p>
+            <w:pPr>
+              <w:pStyle w:val="Compact"/>
+              <w:jc w:val="left"/>
+            </w:pPr>
+            <w:r>
+              <w:t xml:space="preserve">Tag a message with a team (Team A, Team B and so on). Each team has its own colour, shown as a stripe on the left and a small label. Hover over a message in the list and use the buttons that appear on its right: tag a team, flag it, or mark it read or unread. This does not open the message, so it stays unread. Pick a team from the</w:t>
+            </w:r>
+            <w:r>
+              <w:t xml:space="preserve"> </w:t>
+            </w:r>
+            <w:r>
+              <w:t xml:space="preserve">“</w:t>
+            </w:r>
+            <w:r>
+              <w:t xml:space="preserve">All teams</w:t>
+            </w:r>
+            <w:r>
+              <w:t xml:space="preserve">”</w:t>
+            </w:r>
+            <w:r>
+              <w:t xml:space="preserve"> </w:t>
+            </w:r>
+            <w:r>
+              <w:t xml:space="preserve">list to see only that team’s messages. Supervisors and admins can add, rename, recolour or remove teams with</w:t>
+            </w:r>
+            <w:r>
+              <w:t xml:space="preserve"> </w:t>
+            </w:r>
+            <w:r>
+              <w:rPr>
+                <w:bCs/>
+                <w:b/>
+              </w:rPr>
+              <w:t xml:space="preserve">Manage teams</w:t>
+            </w:r>
+            <w:r>
+              <w:t xml:space="preserve"> </w:t>
+            </w:r>
+            <w:r>
+              <w:t xml:space="preserve">in the team menu.</w:t>
+            </w:r>
+          </w:p>
+        </w:tc>
+      </w:tr>
+      <w:tr>
+        <w:tc>
+          <w:tcPr/>
+          <w:p>
+            <w:pPr>
+              <w:pStyle w:val="Compact"/>
+              <w:jc w:val="left"/>
+            </w:pPr>
+            <w:r>
+              <w:rPr>
+                <w:bCs/>
+                <w:b/>
+              </w:rPr>
+              <w:t xml:space="preserve">Assign to me</w:t>
+            </w:r>
+          </w:p>
+        </w:tc>
+        <w:tc>
+          <w:tcPr/>
+          <w:p>
+            <w:pPr>
+              <w:pStyle w:val="Compact"/>
+              <w:jc w:val="left"/>
+            </w:pPr>
+            <w:r>
+              <w:t xml:space="preserve">Marks you as the person handling it. The</w:t>
+            </w:r>
+            <w:r>
+              <w:t xml:space="preserve"> </w:t>
+            </w:r>
+            <w:r>
+              <w:rPr>
+                <w:bCs/>
+                <w:b/>
+              </w:rPr>
+              <w:t xml:space="preserve">Mine</w:t>
+            </w:r>
+            <w:r>
+              <w:t xml:space="preserve"> </w:t>
+            </w:r>
+            <w:r>
+              <w:t xml:space="preserve">tab lists your messages.</w:t>
+            </w:r>
+          </w:p>
+        </w:tc>
+      </w:tr>
+      <w:tr>
+        <w:tc>
+          <w:tcPr/>
+          <w:p>
+            <w:pPr>
+              <w:pStyle w:val="Compact"/>
+              <w:jc w:val="left"/>
+            </w:pPr>
+            <w:r>
+              <w:rPr>
+                <w:bCs/>
+                <w:b/>
+              </w:rPr>
+              <w:t xml:space="preserve">Close without a case</w:t>
+            </w:r>
+          </w:p>
+        </w:tc>
+        <w:tc>
+          <w:tcPr/>
+          <w:p>
+            <w:pPr>
+              <w:pStyle w:val="Compact"/>
+              <w:jc w:val="left"/>
+            </w:pPr>
+            <w:r>
+              <w:t xml:space="preserve">The message stays in the Inbox under</w:t>
+            </w:r>
+            <w:r>
+              <w:t xml:space="preserve"> </w:t>
+            </w:r>
+            <w:r>
+              <w:rPr>
+                <w:bCs/>
+                <w:b/>
+              </w:rPr>
+              <w:t xml:space="preserve">Closed</w:t>
+            </w:r>
+            <w:r>
+              <w:t xml:space="preserve"> </w:t>
+            </w:r>
+            <w:r>
+              <w:t xml:space="preserve">(and</w:t>
+            </w:r>
+            <w:r>
+              <w:t xml:space="preserve"> </w:t>
+            </w:r>
+            <w:r>
+              <w:rPr>
+                <w:bCs/>
+                <w:b/>
+              </w:rPr>
+              <w:t xml:space="preserve">All</w:t>
+            </w:r>
+            <w:r>
+              <w:t xml:space="preserve">). It is marked read. Open it and press</w:t>
+            </w:r>
+            <w:r>
+              <w:t xml:space="preserve"> </w:t>
+            </w:r>
+            <w:r>
+              <w:rPr>
+                <w:bCs/>
+                <w:b/>
+              </w:rPr>
+              <w:t xml:space="preserve">Reopen as unread</w:t>
+            </w:r>
+            <w:r>
+              <w:t xml:space="preserve"> </w:t>
+            </w:r>
+            <w:r>
+              <w:t xml:space="preserve">to bring it back to the queue.</w:t>
+            </w:r>
+          </w:p>
+        </w:tc>
+      </w:tr>
+      <w:tr>
+        <w:tc>
+          <w:tcPr/>
+          <w:p>
+            <w:pPr>
+              <w:pStyle w:val="Compact"/>
+              <w:jc w:val="left"/>
+            </w:pPr>
+            <w:r>
+              <w:rPr>
+                <w:bCs/>
+                <w:b/>
+              </w:rPr>
+              <w:t xml:space="preserve">Select several</w:t>
+            </w:r>
+          </w:p>
+        </w:tc>
+        <w:tc>
+          <w:tcPr/>
+          <w:p>
+            <w:pPr>
+              <w:pStyle w:val="Compact"/>
+              <w:jc w:val="left"/>
+            </w:pPr>
+            <w:r>
+              <w:t xml:space="preserve">Tick the boxes to the left of messages, then mark read or unread, flag, colour, assign to you or close them all at once.</w:t>
             </w:r>
           </w:p>
         </w:tc>
@@ -1024,208 +1254,143 @@
         <w:pStyle w:val="BodyText"/>
       </w:pPr>
       <w:r>
-        <w:t xml:space="preserve">If a reply fails, the reason is shown on the screen. Try again or contact your supervisor.</w:t>
-      </w:r>
-    </w:p>
-    <w:bookmarkEnd w:id="23"/>
-    <w:bookmarkStart w:id="24" w:name="phone-calls"/>
-    <w:p>
-      <w:pPr>
-        <w:pStyle w:val="Heading2"/>
-      </w:pPr>
-      <w:r>
-        <w:t xml:space="preserve">4.2 Phone calls</w:t>
-      </w:r>
-    </w:p>
-    <w:p>
-      <w:pPr>
-        <w:numPr>
-          <w:ilvl w:val="0"/>
-          <w:numId w:val="1004"/>
-        </w:numPr>
-        <w:pStyle w:val="Compact"/>
-      </w:pPr>
-      <w:r>
-        <w:rPr>
-          <w:bCs/>
-          <w:b/>
-        </w:rPr>
-        <w:t xml:space="preserve">Screen-pop:</w:t>
-      </w:r>
-      <w:r>
-        <w:t xml:space="preserve"> </w:t>
-      </w:r>
-      <w:r>
-        <w:t xml:space="preserve">when you answer a call, CX360 opens the caller’s page automatically (if known), showing their history.</w:t>
-      </w:r>
-    </w:p>
-    <w:p>
-      <w:pPr>
-        <w:numPr>
-          <w:ilvl w:val="0"/>
-          <w:numId w:val="1004"/>
-        </w:numPr>
-        <w:pStyle w:val="Compact"/>
-      </w:pPr>
-      <w:r>
-        <w:rPr>
-          <w:bCs/>
-          <w:b/>
-        </w:rPr>
-        <w:t xml:space="preserve">Missed calls:</w:t>
-      </w:r>
-      <w:r>
-        <w:t xml:space="preserve"> </w:t>
-      </w:r>
-      <w:r>
-        <w:t xml:space="preserve">these appear in the Inbox under Phone and on the Overview in</w:t>
-      </w:r>
-      <w:r>
-        <w:t xml:space="preserve"> </w:t>
-      </w:r>
-      <w:r>
-        <w:t xml:space="preserve">“</w:t>
-      </w:r>
-      <w:r>
-        <w:t xml:space="preserve">Missed calls to return</w:t>
-      </w:r>
-      <w:r>
-        <w:t xml:space="preserve">”</w:t>
-      </w:r>
-      <w:r>
-        <w:t xml:space="preserve">. Press</w:t>
-      </w:r>
-      <w:r>
-        <w:t xml:space="preserve"> </w:t>
-      </w:r>
-      <w:r>
-        <w:rPr>
-          <w:bCs/>
-          <w:b/>
-        </w:rPr>
-        <w:t xml:space="preserve">Call back</w:t>
-      </w:r>
-      <w:r>
-        <w:t xml:space="preserve">. A call counts as handled once someone calls back or follows up on another channel.</w:t>
-      </w:r>
-    </w:p>
-    <w:p>
-      <w:pPr>
-        <w:numPr>
-          <w:ilvl w:val="0"/>
-          <w:numId w:val="1004"/>
-        </w:numPr>
-        <w:pStyle w:val="Compact"/>
-      </w:pPr>
-      <w:r>
-        <w:rPr>
-          <w:bCs/>
-          <w:b/>
-        </w:rPr>
-        <w:t xml:space="preserve">After a call:</w:t>
-      </w:r>
-      <w:r>
-        <w:t xml:space="preserve"> </w:t>
-      </w:r>
-      <w:r>
-        <w:t xml:space="preserve">log a case if there is anything to follow up.</w:t>
-      </w:r>
-    </w:p>
-    <w:bookmarkEnd w:id="24"/>
-    <w:bookmarkStart w:id="25" w:name="logging-a-case"/>
-    <w:p>
-      <w:pPr>
-        <w:pStyle w:val="Heading2"/>
-      </w:pPr>
-      <w:r>
-        <w:t xml:space="preserve">4.3 Logging a case</w:t>
-      </w:r>
-    </w:p>
-    <w:p>
-      <w:pPr>
-        <w:numPr>
-          <w:ilvl w:val="0"/>
-          <w:numId w:val="1005"/>
-        </w:numPr>
-        <w:pStyle w:val="Compact"/>
-      </w:pPr>
-      <w:r>
-        <w:t xml:space="preserve">Cases →</w:t>
-      </w:r>
-      <w:r>
-        <w:t xml:space="preserve"> </w:t>
-      </w:r>
-      <w:r>
-        <w:rPr>
-          <w:bCs/>
-          <w:b/>
-        </w:rPr>
-        <w:t xml:space="preserve">Log a case</w:t>
-      </w:r>
-      <w:r>
-        <w:t xml:space="preserve">.</w:t>
-      </w:r>
-    </w:p>
-    <w:p>
-      <w:pPr>
-        <w:numPr>
-          <w:ilvl w:val="0"/>
-          <w:numId w:val="1005"/>
-        </w:numPr>
-        <w:pStyle w:val="Compact"/>
-      </w:pPr>
-      <w:r>
-        <w:t xml:space="preserve">Find the customer (phone, name or account) or add one.</w:t>
-      </w:r>
-    </w:p>
-    <w:p>
-      <w:pPr>
-        <w:numPr>
-          <w:ilvl w:val="0"/>
-          <w:numId w:val="1005"/>
-        </w:numPr>
-        <w:pStyle w:val="Compact"/>
-      </w:pPr>
-      <w:r>
-        <w:t xml:space="preserve">Choose the</w:t>
-      </w:r>
-      <w:r>
-        <w:t xml:space="preserve"> </w:t>
-      </w:r>
-      <w:r>
-        <w:rPr>
-          <w:bCs/>
-          <w:b/>
-        </w:rPr>
-        <w:t xml:space="preserve">case code</w:t>
-      </w:r>
-      <w:r>
-        <w:t xml:space="preserve"> </w:t>
-      </w:r>
-      <w:r>
-        <w:t xml:space="preserve">(category) and describe the issue. Priority and SLA are set from the code.</w:t>
-      </w:r>
-    </w:p>
-    <w:p>
-      <w:pPr>
-        <w:numPr>
-          <w:ilvl w:val="0"/>
-          <w:numId w:val="1005"/>
-        </w:numPr>
-        <w:pStyle w:val="Compact"/>
-      </w:pPr>
-      <w:r>
-        <w:t xml:space="preserve">Save. A case number is issued and the SLA clock starts.</w:t>
-      </w:r>
-    </w:p>
-    <w:bookmarkEnd w:id="25"/>
-    <w:bookmarkStart w:id="26" w:name="working-a-case"/>
-    <w:p>
-      <w:pPr>
-        <w:pStyle w:val="Heading2"/>
-      </w:pPr>
-      <w:r>
-        <w:t xml:space="preserve">4.4 Working a case</w:t>
+        <w:t xml:space="preserve">The tabs at the top of the list are</w:t>
+      </w:r>
+      <w:r>
+        <w:t xml:space="preserve"> </w:t>
+      </w:r>
+      <w:r>
+        <w:rPr>
+          <w:bCs/>
+          <w:b/>
+        </w:rPr>
+        <w:t xml:space="preserve">Open</w:t>
+      </w:r>
+      <w:r>
+        <w:t xml:space="preserve">,</w:t>
+      </w:r>
+      <w:r>
+        <w:t xml:space="preserve"> </w:t>
+      </w:r>
+      <w:r>
+        <w:rPr>
+          <w:bCs/>
+          <w:b/>
+        </w:rPr>
+        <w:t xml:space="preserve">Unread</w:t>
+      </w:r>
+      <w:r>
+        <w:t xml:space="preserve">,</w:t>
+      </w:r>
+      <w:r>
+        <w:t xml:space="preserve"> </w:t>
+      </w:r>
+      <w:r>
+        <w:rPr>
+          <w:bCs/>
+          <w:b/>
+        </w:rPr>
+        <w:t xml:space="preserve">Read</w:t>
+      </w:r>
+      <w:r>
+        <w:t xml:space="preserve">,</w:t>
+      </w:r>
+      <w:r>
+        <w:t xml:space="preserve"> </w:t>
+      </w:r>
+      <w:r>
+        <w:rPr>
+          <w:bCs/>
+          <w:b/>
+        </w:rPr>
+        <w:t xml:space="preserve">Flagged</w:t>
+      </w:r>
+      <w:r>
+        <w:t xml:space="preserve">,</w:t>
+      </w:r>
+      <w:r>
+        <w:t xml:space="preserve"> </w:t>
+      </w:r>
+      <w:r>
+        <w:rPr>
+          <w:bCs/>
+          <w:b/>
+        </w:rPr>
+        <w:t xml:space="preserve">Mine</w:t>
+      </w:r>
+      <w:r>
+        <w:t xml:space="preserve">,</w:t>
+      </w:r>
+      <w:r>
+        <w:t xml:space="preserve"> </w:t>
+      </w:r>
+      <w:r>
+        <w:rPr>
+          <w:bCs/>
+          <w:b/>
+        </w:rPr>
+        <w:t xml:space="preserve">Closed</w:t>
+      </w:r>
+      <w:r>
+        <w:t xml:space="preserve"> </w:t>
+      </w:r>
+      <w:r>
+        <w:t xml:space="preserve">and</w:t>
+      </w:r>
+      <w:r>
+        <w:t xml:space="preserve"> </w:t>
+      </w:r>
+      <w:r>
+        <w:rPr>
+          <w:bCs/>
+          <w:b/>
+        </w:rPr>
+        <w:t xml:space="preserve">All</w:t>
+      </w:r>
+      <w:r>
+        <w:t xml:space="preserve">. Read state is shared by the whole team: if one person opens a message, it shows as read for everyone. Other shortcuts:</w:t>
+      </w:r>
+      <w:r>
+        <w:t xml:space="preserve"> </w:t>
+      </w:r>
+      <w:r>
+        <w:rPr>
+          <w:rStyle w:val="VerbatimChar"/>
+        </w:rPr>
+        <w:t xml:space="preserve">j</w:t>
+      </w:r>
+      <w:r>
+        <w:t xml:space="preserve"> </w:t>
+      </w:r>
+      <w:r>
+        <w:t xml:space="preserve">next message,</w:t>
+      </w:r>
+      <w:r>
+        <w:t xml:space="preserve"> </w:t>
+      </w:r>
+      <w:r>
+        <w:rPr>
+          <w:rStyle w:val="VerbatimChar"/>
+        </w:rPr>
+        <w:t xml:space="preserve">k</w:t>
+      </w:r>
+      <w:r>
+        <w:t xml:space="preserve"> </w:t>
+      </w:r>
+      <w:r>
+        <w:t xml:space="preserve">previous. The list refreshes itself every 45 seconds. Closed and linked messages are kept in view for 30 days.</w:t>
+      </w:r>
+    </w:p>
+    <w:p>
+      <w:pPr>
+        <w:pStyle w:val="BodyText"/>
+      </w:pPr>
+      <w:r>
+        <w:rPr>
+          <w:bCs/>
+          <w:b/>
+        </w:rPr>
+        <w:t xml:space="preserve">Reply rules by channel</w:t>
       </w:r>
     </w:p>
     <w:tbl>
@@ -1251,97 +1416,45 @@
               <w:jc w:val="left"/>
             </w:pPr>
             <w:r>
-              <w:t xml:space="preserve">Status</w:t>
-            </w:r>
-          </w:p>
-        </w:tc>
-        <w:tc>
-          <w:tcPr/>
-          <w:p>
-            <w:pPr>
-              <w:pStyle w:val="Compact"/>
-              <w:jc w:val="left"/>
-            </w:pPr>
-            <w:r>
-              <w:t xml:space="preserve">Meaning</w:t>
-            </w:r>
-          </w:p>
-        </w:tc>
-      </w:tr>
-      <w:tr>
-        <w:tc>
-          <w:tcPr/>
-          <w:p>
-            <w:pPr>
-              <w:pStyle w:val="Compact"/>
-              <w:jc w:val="left"/>
-            </w:pPr>
-            <w:r>
-              <w:t xml:space="preserve">New</w:t>
-            </w:r>
-          </w:p>
-        </w:tc>
-        <w:tc>
-          <w:tcPr/>
-          <w:p>
-            <w:pPr>
-              <w:pStyle w:val="Compact"/>
-              <w:jc w:val="left"/>
-            </w:pPr>
-            <w:r>
-              <w:t xml:space="preserve">Just logged</w:t>
-            </w:r>
-          </w:p>
-        </w:tc>
-      </w:tr>
-      <w:tr>
-        <w:tc>
-          <w:tcPr/>
-          <w:p>
-            <w:pPr>
-              <w:pStyle w:val="Compact"/>
-              <w:jc w:val="left"/>
-            </w:pPr>
-            <w:r>
-              <w:t xml:space="preserve">Open / In progress</w:t>
-            </w:r>
-          </w:p>
-        </w:tc>
-        <w:tc>
-          <w:tcPr/>
-          <w:p>
-            <w:pPr>
-              <w:pStyle w:val="Compact"/>
-              <w:jc w:val="left"/>
-            </w:pPr>
-            <w:r>
-              <w:t xml:space="preserve">Being worked</w:t>
-            </w:r>
-          </w:p>
-        </w:tc>
-      </w:tr>
-      <w:tr>
-        <w:tc>
-          <w:tcPr/>
-          <w:p>
-            <w:pPr>
-              <w:pStyle w:val="Compact"/>
-              <w:jc w:val="left"/>
-            </w:pPr>
-            <w:r>
-              <w:t xml:space="preserve">Pending with Bank unit / 3rd party</w:t>
-            </w:r>
-          </w:p>
-        </w:tc>
-        <w:tc>
-          <w:tcPr/>
-          <w:p>
-            <w:pPr>
-              <w:pStyle w:val="Compact"/>
-              <w:jc w:val="left"/>
-            </w:pPr>
-            <w:r>
-              <w:t xml:space="preserve">Waiting on someone else.</w:t>
+              <w:t xml:space="preserve">Channel</w:t>
+            </w:r>
+          </w:p>
+        </w:tc>
+        <w:tc>
+          <w:tcPr/>
+          <w:p>
+            <w:pPr>
+              <w:pStyle w:val="Compact"/>
+              <w:jc w:val="left"/>
+            </w:pPr>
+            <w:r>
+              <w:t xml:space="preserve">Rule</w:t>
+            </w:r>
+          </w:p>
+        </w:tc>
+      </w:tr>
+      <w:tr>
+        <w:tc>
+          <w:tcPr/>
+          <w:p>
+            <w:pPr>
+              <w:pStyle w:val="Compact"/>
+              <w:jc w:val="left"/>
+            </w:pPr>
+            <w:r>
+              <w:t xml:space="preserve">WhatsApp, Instagram, Messenger</w:t>
+            </w:r>
+          </w:p>
+        </w:tc>
+        <w:tc>
+          <w:tcPr/>
+          <w:p>
+            <w:pPr>
+              <w:pStyle w:val="Compact"/>
+              <w:jc w:val="left"/>
+            </w:pPr>
+            <w:r>
+              <w:t xml:space="preserve">You can reply only within</w:t>
             </w:r>
             <w:r>
               <w:t xml:space="preserve"> </w:t>
@@ -1351,119 +1464,141 @@
                 <w:bCs/>
                 <w:b/>
               </w:rPr>
-              <w:t xml:space="preserve">Choose the unit</w:t>
+              <w:t xml:space="preserve">24 hours</w:t>
             </w:r>
             <w:r>
               <w:t xml:space="preserve"> </w:t>
             </w:r>
             <w:r>
-              <w:t xml:space="preserve">so it can be chased.</w:t>
-            </w:r>
-          </w:p>
-        </w:tc>
-      </w:tr>
-      <w:tr>
-        <w:tc>
-          <w:tcPr/>
-          <w:p>
-            <w:pPr>
-              <w:pStyle w:val="Compact"/>
-              <w:jc w:val="left"/>
-            </w:pPr>
-            <w:r>
-              <w:t xml:space="preserve">Resolved</w:t>
-            </w:r>
-          </w:p>
-        </w:tc>
-        <w:tc>
-          <w:tcPr/>
-          <w:p>
-            <w:pPr>
-              <w:pStyle w:val="Compact"/>
-              <w:jc w:val="left"/>
-            </w:pPr>
-            <w:r>
-              <w:t xml:space="preserve">Fixed, awaiting confirmation</w:t>
-            </w:r>
-          </w:p>
-        </w:tc>
-      </w:tr>
-      <w:tr>
-        <w:tc>
-          <w:tcPr/>
-          <w:p>
-            <w:pPr>
-              <w:pStyle w:val="Compact"/>
-              <w:jc w:val="left"/>
-            </w:pPr>
-            <w:r>
-              <w:t xml:space="preserve">Closed</w:t>
-            </w:r>
-          </w:p>
-        </w:tc>
-        <w:tc>
-          <w:tcPr/>
-          <w:p>
-            <w:pPr>
-              <w:pStyle w:val="Compact"/>
-              <w:jc w:val="left"/>
-            </w:pPr>
-            <w:r>
-              <w:t xml:space="preserve">Finished</w:t>
+              <w:t xml:space="preserve">of the customer’s last message. After that CX360 tells you the window is closed.</w:t>
+            </w:r>
+          </w:p>
+        </w:tc>
+      </w:tr>
+      <w:tr>
+        <w:tc>
+          <w:tcPr/>
+          <w:p>
+            <w:pPr>
+              <w:pStyle w:val="Compact"/>
+              <w:jc w:val="left"/>
+            </w:pPr>
+            <w:r>
+              <w:t xml:space="preserve">X</w:t>
+            </w:r>
+          </w:p>
+        </w:tc>
+        <w:tc>
+          <w:tcPr/>
+          <w:p>
+            <w:pPr>
+              <w:pStyle w:val="Compact"/>
+              <w:jc w:val="left"/>
+            </w:pPr>
+            <w:r>
+              <w:t xml:space="preserve">Replies are sent; each one may carry a small cost, so keep them short.</w:t>
+            </w:r>
+          </w:p>
+        </w:tc>
+      </w:tr>
+      <w:tr>
+        <w:tc>
+          <w:tcPr/>
+          <w:p>
+            <w:pPr>
+              <w:pStyle w:val="Compact"/>
+              <w:jc w:val="left"/>
+            </w:pPr>
+            <w:r>
+              <w:t xml:space="preserve">Email, SMS</w:t>
+            </w:r>
+          </w:p>
+        </w:tc>
+        <w:tc>
+          <w:tcPr/>
+          <w:p>
+            <w:pPr>
+              <w:pStyle w:val="Compact"/>
+              <w:jc w:val="left"/>
+            </w:pPr>
+            <w:r>
+              <w:t xml:space="preserve">Sent normally.</w:t>
+            </w:r>
+          </w:p>
+        </w:tc>
+      </w:tr>
+      <w:tr>
+        <w:tc>
+          <w:tcPr/>
+          <w:p>
+            <w:pPr>
+              <w:pStyle w:val="Compact"/>
+              <w:jc w:val="left"/>
+            </w:pPr>
+            <w:r>
+              <w:t xml:space="preserve">Phone, chat, portal</w:t>
+            </w:r>
+          </w:p>
+        </w:tc>
+        <w:tc>
+          <w:tcPr/>
+          <w:p>
+            <w:pPr>
+              <w:pStyle w:val="Compact"/>
+              <w:jc w:val="left"/>
+            </w:pPr>
+            <w:r>
+              <w:t xml:space="preserve">Notes only. Nothing is sent to the customer.</w:t>
             </w:r>
           </w:p>
         </w:tc>
       </w:tr>
     </w:tbl>
+    <w:p>
+      <w:pPr>
+        <w:pStyle w:val="BodyText"/>
+      </w:pPr>
+      <w:r>
+        <w:t xml:space="preserve">If a reply fails, the reason is shown on the screen. Try again or contact your supervisor.</w:t>
+      </w:r>
+    </w:p>
+    <w:bookmarkEnd w:id="23"/>
+    <w:bookmarkStart w:id="24" w:name="phone-calls"/>
+    <w:p>
+      <w:pPr>
+        <w:pStyle w:val="Heading2"/>
+      </w:pPr>
+      <w:r>
+        <w:t xml:space="preserve">4.2 Phone calls</w:t>
+      </w:r>
+    </w:p>
     <w:p>
       <w:pPr>
         <w:numPr>
           <w:ilvl w:val="0"/>
-          <w:numId w:val="1006"/>
+          <w:numId w:val="1004"/>
         </w:numPr>
         <w:pStyle w:val="Compact"/>
       </w:pPr>
       <w:r>
-        <w:t xml:space="preserve">Add</w:t>
-      </w:r>
-      <w:r>
-        <w:t xml:space="preserve"> </w:t>
-      </w:r>
-      <w:r>
-        <w:rPr>
-          <w:bCs/>
-          <w:b/>
-        </w:rPr>
-        <w:t xml:space="preserve">comments</w:t>
-      </w:r>
-      <w:r>
-        <w:t xml:space="preserve"> </w:t>
-      </w:r>
-      <w:r>
-        <w:t xml:space="preserve">(internal notes) and</w:t>
-      </w:r>
-      <w:r>
-        <w:t xml:space="preserve"> </w:t>
-      </w:r>
-      <w:r>
-        <w:rPr>
-          <w:bCs/>
-          <w:b/>
-        </w:rPr>
-        <w:t xml:space="preserve">attachments</w:t>
-      </w:r>
-      <w:r>
-        <w:t xml:space="preserve"> </w:t>
-      </w:r>
-      <w:r>
-        <w:t xml:space="preserve">in the case timeline.</w:t>
+        <w:rPr>
+          <w:bCs/>
+          <w:b/>
+        </w:rPr>
+        <w:t xml:space="preserve">Screen-pop:</w:t>
+      </w:r>
+      <w:r>
+        <w:t xml:space="preserve"> </w:t>
+      </w:r>
+      <w:r>
+        <w:t xml:space="preserve">when you answer a call, CX360 opens the caller’s page automatically (if known), showing their history.</w:t>
       </w:r>
     </w:p>
     <w:p>
       <w:pPr>
         <w:numPr>
           <w:ilvl w:val="0"/>
-          <w:numId w:val="1006"/>
+          <w:numId w:val="1004"/>
         </w:numPr>
         <w:pStyle w:val="Compact"/>
       </w:pPr>
@@ -1472,20 +1607,48 @@
           <w:bCs/>
           <w:b/>
         </w:rPr>
-        <w:t xml:space="preserve">Reuse this ticket</w:t>
-      </w:r>
-      <w:r>
-        <w:t xml:space="preserve"> </w:t>
-      </w:r>
-      <w:r>
-        <w:t xml:space="preserve">copies a closed case’s details when the same customer comes back with a similar issue.</w:t>
+        <w:t xml:space="preserve">Missed calls:</w:t>
+      </w:r>
+      <w:r>
+        <w:t xml:space="preserve"> </w:t>
+      </w:r>
+      <w:r>
+        <w:t xml:space="preserve">these appear in the Inbox under Phone and on the Overview in</w:t>
+      </w:r>
+      <w:r>
+        <w:t xml:space="preserve"> </w:t>
+      </w:r>
+      <w:r>
+        <w:t xml:space="preserve">“</w:t>
+      </w:r>
+      <w:r>
+        <w:t xml:space="preserve">Missed calls to return</w:t>
+      </w:r>
+      <w:r>
+        <w:t xml:space="preserve">”</w:t>
+      </w:r>
+      <w:r>
+        <w:t xml:space="preserve">. Press</w:t>
+      </w:r>
+      <w:r>
+        <w:t xml:space="preserve"> </w:t>
+      </w:r>
+      <w:r>
+        <w:rPr>
+          <w:bCs/>
+          <w:b/>
+        </w:rPr>
+        <w:t xml:space="preserve">Call back</w:t>
+      </w:r>
+      <w:r>
+        <w:t xml:space="preserve">. A call counts as handled once someone calls back or follows up on another channel.</w:t>
       </w:r>
     </w:p>
     <w:p>
       <w:pPr>
         <w:numPr>
           <w:ilvl w:val="0"/>
-          <w:numId w:val="1006"/>
+          <w:numId w:val="1004"/>
         </w:numPr>
         <w:pStyle w:val="Compact"/>
       </w:pPr>
@@ -1494,215 +1657,110 @@
           <w:bCs/>
           <w:b/>
         </w:rPr>
-        <w:t xml:space="preserve">SLA colours:</w:t>
-      </w:r>
-      <w:r>
-        <w:t xml:space="preserve"> </w:t>
-      </w:r>
-      <w:r>
-        <w:t xml:space="preserve">green on track, amber close to the limit, red breached. Work red first.</w:t>
-      </w:r>
-    </w:p>
-    <w:bookmarkEnd w:id="26"/>
-    <w:bookmarkStart w:id="27" w:name="the-customer-page"/>
+        <w:t xml:space="preserve">After a call:</w:t>
+      </w:r>
+      <w:r>
+        <w:t xml:space="preserve"> </w:t>
+      </w:r>
+      <w:r>
+        <w:t xml:space="preserve">log a case if there is anything to follow up.</w:t>
+      </w:r>
+    </w:p>
+    <w:bookmarkEnd w:id="24"/>
+    <w:bookmarkStart w:id="25" w:name="logging-a-case"/>
     <w:p>
       <w:pPr>
         <w:pStyle w:val="Heading2"/>
       </w:pPr>
       <w:r>
-        <w:t xml:space="preserve">4.5 The customer page</w:t>
-      </w:r>
-    </w:p>
-    <w:p>
-      <w:pPr>
-        <w:pStyle w:val="FirstParagraph"/>
-      </w:pPr>
-      <w:r>
-        <w:t xml:space="preserve">Shows profile, cases, all messages across channels, accounts, feedback, and a</w:t>
-      </w:r>
-      <w:r>
-        <w:t xml:space="preserve"> </w:t>
-      </w:r>
-      <w:r>
-        <w:rPr>
-          <w:bCs/>
-          <w:b/>
-        </w:rPr>
-        <w:t xml:space="preserve">live core-banking card</w:t>
-      </w:r>
-      <w:r>
-        <w:t xml:space="preserve"> </w:t>
-      </w:r>
-      <w:r>
-        <w:t xml:space="preserve">with balance and recent transactions (when connected). Use it to verify and answer without switching systems.</w:t>
-      </w:r>
-    </w:p>
-    <w:bookmarkEnd w:id="27"/>
-    <w:bookmarkEnd w:id="28"/>
-    <w:bookmarkStart w:id="29" w:name="supervisors"/>
-    <w:p>
-      <w:pPr>
-        <w:pStyle w:val="Heading1"/>
-      </w:pPr>
-      <w:r>
-        <w:t xml:space="preserve">5. Supervisors</w:t>
+        <w:t xml:space="preserve">4.3 Logging a case</w:t>
       </w:r>
     </w:p>
     <w:p>
       <w:pPr>
         <w:numPr>
           <w:ilvl w:val="0"/>
-          <w:numId w:val="1007"/>
+          <w:numId w:val="1005"/>
         </w:numPr>
         <w:pStyle w:val="Compact"/>
       </w:pPr>
       <w:r>
-        <w:rPr>
-          <w:bCs/>
-          <w:b/>
-        </w:rPr>
-        <w:t xml:space="preserve">Cases:</w:t>
-      </w:r>
-      <w:r>
-        <w:t xml:space="preserve"> </w:t>
-      </w:r>
-      <w:r>
-        <w:t xml:space="preserve">tabs show scopes (for example mine, my team, all, overdue). Use filters for status, priority, date, agent.</w:t>
+        <w:t xml:space="preserve">Cases →</w:t>
+      </w:r>
+      <w:r>
+        <w:t xml:space="preserve"> </w:t>
+      </w:r>
+      <w:r>
+        <w:rPr>
+          <w:bCs/>
+          <w:b/>
+        </w:rPr>
+        <w:t xml:space="preserve">Log a case</w:t>
+      </w:r>
+      <w:r>
+        <w:t xml:space="preserve">.</w:t>
       </w:r>
     </w:p>
     <w:p>
       <w:pPr>
         <w:numPr>
           <w:ilvl w:val="0"/>
-          <w:numId w:val="1007"/>
+          <w:numId w:val="1005"/>
         </w:numPr>
         <w:pStyle w:val="Compact"/>
       </w:pPr>
       <w:r>
-        <w:rPr>
-          <w:bCs/>
-          <w:b/>
-        </w:rPr>
-        <w:t xml:space="preserve">Export:</w:t>
-      </w:r>
-      <w:r>
-        <w:t xml:space="preserve"> </w:t>
-      </w:r>
-      <w:r>
-        <w:t xml:space="preserve">download to Excel, up to 92 days at a time.</w:t>
+        <w:t xml:space="preserve">Find the customer (phone, name or account) or add one.</w:t>
       </w:r>
     </w:p>
     <w:p>
       <w:pPr>
         <w:numPr>
           <w:ilvl w:val="0"/>
-          <w:numId w:val="1007"/>
+          <w:numId w:val="1005"/>
         </w:numPr>
         <w:pStyle w:val="Compact"/>
       </w:pPr>
       <w:r>
-        <w:rPr>
-          <w:bCs/>
-          <w:b/>
-        </w:rPr>
-        <w:t xml:space="preserve">Batch close:</w:t>
-      </w:r>
-      <w:r>
-        <w:t xml:space="preserve"> </w:t>
-      </w:r>
-      <w:r>
-        <w:t xml:space="preserve">tick several cases and close them together.</w:t>
+        <w:t xml:space="preserve">Choose the</w:t>
+      </w:r>
+      <w:r>
+        <w:t xml:space="preserve"> </w:t>
+      </w:r>
+      <w:r>
+        <w:rPr>
+          <w:bCs/>
+          <w:b/>
+        </w:rPr>
+        <w:t xml:space="preserve">case code</w:t>
+      </w:r>
+      <w:r>
+        <w:t xml:space="preserve"> </w:t>
+      </w:r>
+      <w:r>
+        <w:t xml:space="preserve">(category) and describe the issue. Priority and SLA are set from the code.</w:t>
       </w:r>
     </w:p>
     <w:p>
       <w:pPr>
         <w:numPr>
           <w:ilvl w:val="0"/>
-          <w:numId w:val="1007"/>
+          <w:numId w:val="1005"/>
         </w:numPr>
         <w:pStyle w:val="Compact"/>
       </w:pPr>
       <w:r>
-        <w:rPr>
-          <w:bCs/>
-          <w:b/>
-        </w:rPr>
-        <w:t xml:space="preserve">Quality review:</w:t>
-      </w:r>
-      <w:r>
-        <w:t xml:space="preserve"> </w:t>
-      </w:r>
-      <w:r>
-        <w:t xml:space="preserve">open a case → QA panel → score it and leave coaching notes for the agent.</w:t>
-      </w:r>
-    </w:p>
-    <w:p>
-      <w:pPr>
-        <w:numPr>
-          <w:ilvl w:val="0"/>
-          <w:numId w:val="1007"/>
-        </w:numPr>
-        <w:pStyle w:val="Compact"/>
-      </w:pPr>
-      <w:r>
-        <w:rPr>
-          <w:bCs/>
-          <w:b/>
-        </w:rPr>
-        <w:t xml:space="preserve">Analytics:</w:t>
-      </w:r>
-      <w:r>
-        <w:t xml:space="preserve"> </w:t>
-      </w:r>
-      <w:r>
-        <w:t xml:space="preserve">volume, SLA, resolution time, agent results, and the</w:t>
-      </w:r>
-      <w:r>
-        <w:t xml:space="preserve"> </w:t>
-      </w:r>
-      <w:r>
-        <w:rPr>
-          <w:bCs/>
-          <w:b/>
-        </w:rPr>
-        <w:t xml:space="preserve">Channels</w:t>
-      </w:r>
-      <w:r>
-        <w:t xml:space="preserve"> </w:t>
-      </w:r>
-      <w:r>
-        <w:t xml:space="preserve">section: volume per channel, average response time per channel, and missed calls nobody returned.</w:t>
-      </w:r>
-    </w:p>
-    <w:bookmarkEnd w:id="29"/>
-    <w:bookmarkStart w:id="30" w:name="administrators"/>
-    <w:p>
-      <w:pPr>
-        <w:pStyle w:val="Heading1"/>
-      </w:pPr>
-      <w:r>
-        <w:t xml:space="preserve">6. Administrators</w:t>
-      </w:r>
-    </w:p>
-    <w:p>
-      <w:pPr>
-        <w:pStyle w:val="FirstParagraph"/>
-      </w:pPr>
-      <w:r>
-        <w:t xml:space="preserve">All under</w:t>
-      </w:r>
-      <w:r>
-        <w:t xml:space="preserve"> </w:t>
-      </w:r>
-      <w:r>
-        <w:rPr>
-          <w:bCs/>
-          <w:b/>
-        </w:rPr>
-        <w:t xml:space="preserve">Admin</w:t>
-      </w:r>
-      <w:r>
-        <w:t xml:space="preserve">.</w:t>
+        <w:t xml:space="preserve">Save. A case number is issued and the SLA clock starts.</w:t>
+      </w:r>
+    </w:p>
+    <w:bookmarkEnd w:id="25"/>
+    <w:bookmarkStart w:id="26" w:name="working-a-case"/>
+    <w:p>
+      <w:pPr>
+        <w:pStyle w:val="Heading2"/>
+      </w:pPr>
+      <w:r>
+        <w:t xml:space="preserve">4.4 Working a case</w:t>
       </w:r>
     </w:p>
     <w:tbl>
@@ -1728,468 +1786,165 @@
               <w:jc w:val="left"/>
             </w:pPr>
             <w:r>
-              <w:t xml:space="preserve">Setting</w:t>
-            </w:r>
-          </w:p>
-        </w:tc>
-        <w:tc>
-          <w:tcPr/>
-          <w:p>
-            <w:pPr>
-              <w:pStyle w:val="Compact"/>
-              <w:jc w:val="left"/>
-            </w:pPr>
-            <w:r>
-              <w:t xml:space="preserve">What it does</w:t>
-            </w:r>
-          </w:p>
-        </w:tc>
-      </w:tr>
-      <w:tr>
-        <w:tc>
-          <w:tcPr/>
-          <w:p>
-            <w:pPr>
-              <w:pStyle w:val="Compact"/>
-              <w:jc w:val="left"/>
-            </w:pPr>
+              <w:t xml:space="preserve">Status</w:t>
+            </w:r>
+          </w:p>
+        </w:tc>
+        <w:tc>
+          <w:tcPr/>
+          <w:p>
+            <w:pPr>
+              <w:pStyle w:val="Compact"/>
+              <w:jc w:val="left"/>
+            </w:pPr>
+            <w:r>
+              <w:t xml:space="preserve">Meaning</w:t>
+            </w:r>
+          </w:p>
+        </w:tc>
+      </w:tr>
+      <w:tr>
+        <w:tc>
+          <w:tcPr/>
+          <w:p>
+            <w:pPr>
+              <w:pStyle w:val="Compact"/>
+              <w:jc w:val="left"/>
+            </w:pPr>
+            <w:r>
+              <w:t xml:space="preserve">New</w:t>
+            </w:r>
+          </w:p>
+        </w:tc>
+        <w:tc>
+          <w:tcPr/>
+          <w:p>
+            <w:pPr>
+              <w:pStyle w:val="Compact"/>
+              <w:jc w:val="left"/>
+            </w:pPr>
+            <w:r>
+              <w:t xml:space="preserve">Just logged</w:t>
+            </w:r>
+          </w:p>
+        </w:tc>
+      </w:tr>
+      <w:tr>
+        <w:tc>
+          <w:tcPr/>
+          <w:p>
+            <w:pPr>
+              <w:pStyle w:val="Compact"/>
+              <w:jc w:val="left"/>
+            </w:pPr>
+            <w:r>
+              <w:t xml:space="preserve">Open / In progress</w:t>
+            </w:r>
+          </w:p>
+        </w:tc>
+        <w:tc>
+          <w:tcPr/>
+          <w:p>
+            <w:pPr>
+              <w:pStyle w:val="Compact"/>
+              <w:jc w:val="left"/>
+            </w:pPr>
+            <w:r>
+              <w:t xml:space="preserve">Being worked</w:t>
+            </w:r>
+          </w:p>
+        </w:tc>
+      </w:tr>
+      <w:tr>
+        <w:tc>
+          <w:tcPr/>
+          <w:p>
+            <w:pPr>
+              <w:pStyle w:val="Compact"/>
+              <w:jc w:val="left"/>
+            </w:pPr>
+            <w:r>
+              <w:t xml:space="preserve">Pending with Bank unit / 3rd party</w:t>
+            </w:r>
+          </w:p>
+        </w:tc>
+        <w:tc>
+          <w:tcPr/>
+          <w:p>
+            <w:pPr>
+              <w:pStyle w:val="Compact"/>
+              <w:jc w:val="left"/>
+            </w:pPr>
+            <w:r>
+              <w:t xml:space="preserve">Waiting on someone else.</w:t>
+            </w:r>
+            <w:r>
+              <w:t xml:space="preserve"> </w:t>
+            </w:r>
             <w:r>
               <w:rPr>
                 <w:bCs/>
                 <w:b/>
               </w:rPr>
-              <w:t xml:space="preserve">Users &amp; roles</w:t>
-            </w:r>
-          </w:p>
-        </w:tc>
-        <w:tc>
-          <w:tcPr/>
-          <w:p>
-            <w:pPr>
-              <w:pStyle w:val="Compact"/>
-              <w:jc w:val="left"/>
-            </w:pPr>
-            <w:r>
-              <w:t xml:space="preserve">Add users (temporary password shown once), change roles, deactivate, reset password</w:t>
-            </w:r>
-          </w:p>
-        </w:tc>
-      </w:tr>
-      <w:tr>
-        <w:tc>
-          <w:tcPr/>
-          <w:p>
-            <w:pPr>
-              <w:pStyle w:val="Compact"/>
-              <w:jc w:val="left"/>
-            </w:pPr>
-            <w:r>
-              <w:rPr>
-                <w:bCs/>
-                <w:b/>
-              </w:rPr>
-              <w:t xml:space="preserve">Departments</w:t>
-            </w:r>
-          </w:p>
-        </w:tc>
-        <w:tc>
-          <w:tcPr/>
-          <w:p>
-            <w:pPr>
-              <w:pStyle w:val="Compact"/>
-              <w:jc w:val="left"/>
-            </w:pPr>
-            <w:r>
-              <w:t xml:space="preserve">Teams and units</w:t>
-            </w:r>
-          </w:p>
-        </w:tc>
-      </w:tr>
-      <w:tr>
-        <w:tc>
-          <w:tcPr/>
-          <w:p>
-            <w:pPr>
-              <w:pStyle w:val="Compact"/>
-              <w:jc w:val="left"/>
-            </w:pPr>
-            <w:r>
-              <w:rPr>
-                <w:bCs/>
-                <w:b/>
-              </w:rPr>
-              <w:t xml:space="preserve">Case codes</w:t>
-            </w:r>
-          </w:p>
-        </w:tc>
-        <w:tc>
-          <w:tcPr/>
-          <w:p>
-            <w:pPr>
-              <w:pStyle w:val="Compact"/>
-              <w:jc w:val="left"/>
-            </w:pPr>
-            <w:r>
-              <w:t xml:space="preserve">Categories, default priority and SLA</w:t>
-            </w:r>
-          </w:p>
-        </w:tc>
-      </w:tr>
-      <w:tr>
-        <w:tc>
-          <w:tcPr/>
-          <w:p>
-            <w:pPr>
-              <w:pStyle w:val="Compact"/>
-              <w:jc w:val="left"/>
-            </w:pPr>
-            <w:r>
-              <w:rPr>
-                <w:bCs/>
-                <w:b/>
-              </w:rPr>
-              <w:t xml:space="preserve">SLA policies</w:t>
-            </w:r>
-          </w:p>
-        </w:tc>
-        <w:tc>
-          <w:tcPr/>
-          <w:p>
-            <w:pPr>
-              <w:pStyle w:val="Compact"/>
-              <w:jc w:val="left"/>
-            </w:pPr>
-            <w:r>
-              <w:t xml:space="preserve">Time limits per priority</w:t>
-            </w:r>
-          </w:p>
-        </w:tc>
-      </w:tr>
-      <w:tr>
-        <w:tc>
-          <w:tcPr/>
-          <w:p>
-            <w:pPr>
-              <w:pStyle w:val="Compact"/>
-              <w:jc w:val="left"/>
-            </w:pPr>
-            <w:r>
-              <w:rPr>
-                <w:bCs/>
-                <w:b/>
-              </w:rPr>
-              <w:t xml:space="preserve">Business hours</w:t>
-            </w:r>
-          </w:p>
-        </w:tc>
-        <w:tc>
-          <w:tcPr/>
-          <w:p>
-            <w:pPr>
-              <w:pStyle w:val="Compact"/>
-              <w:jc w:val="left"/>
-            </w:pPr>
-            <w:r>
-              <w:t xml:space="preserve">Working hours and holidays for SLA counting</w:t>
-            </w:r>
-          </w:p>
-        </w:tc>
-      </w:tr>
-      <w:tr>
-        <w:tc>
-          <w:tcPr/>
-          <w:p>
-            <w:pPr>
-              <w:pStyle w:val="Compact"/>
-              <w:jc w:val="left"/>
-            </w:pPr>
-            <w:r>
-              <w:rPr>
-                <w:bCs/>
-                <w:b/>
-              </w:rPr>
-              <w:t xml:space="preserve">SLA escalation</w:t>
-            </w:r>
-          </w:p>
-        </w:tc>
-        <w:tc>
-          <w:tcPr/>
-          <w:p>
-            <w:pPr>
-              <w:pStyle w:val="Compact"/>
-              <w:jc w:val="left"/>
-            </w:pPr>
-            <w:r>
-              <w:t xml:space="preserve">Who is alerted at what point</w:t>
-            </w:r>
-          </w:p>
-        </w:tc>
-      </w:tr>
-      <w:tr>
-        <w:tc>
-          <w:tcPr/>
-          <w:p>
-            <w:pPr>
-              <w:pStyle w:val="Compact"/>
-              <w:jc w:val="left"/>
-            </w:pPr>
-            <w:r>
-              <w:rPr>
-                <w:bCs/>
-                <w:b/>
-              </w:rPr>
-              <w:t xml:space="preserve">Notification centre</w:t>
-            </w:r>
-          </w:p>
-        </w:tc>
-        <w:tc>
-          <w:tcPr/>
-          <w:p>
-            <w:pPr>
-              <w:pStyle w:val="Compact"/>
-              <w:jc w:val="left"/>
-            </w:pPr>
-            <w:r>
-              <w:t xml:space="preserve">Email and SMS gateways, message templates, tests</w:t>
-            </w:r>
-          </w:p>
-        </w:tc>
-      </w:tr>
-      <w:tr>
-        <w:tc>
-          <w:tcPr/>
-          <w:p>
-            <w:pPr>
-              <w:pStyle w:val="Compact"/>
-              <w:jc w:val="left"/>
-            </w:pPr>
-            <w:r>
-              <w:rPr>
-                <w:bCs/>
-                <w:b/>
-              </w:rPr>
-              <w:t xml:space="preserve">Core banking</w:t>
-            </w:r>
-          </w:p>
-        </w:tc>
-        <w:tc>
-          <w:tcPr/>
-          <w:p>
-            <w:pPr>
-              <w:pStyle w:val="Compact"/>
-              <w:jc w:val="left"/>
-            </w:pPr>
-            <w:r>
-              <w:t xml:space="preserve">Connects live balance and transactions</w:t>
-            </w:r>
-          </w:p>
-        </w:tc>
-      </w:tr>
-      <w:tr>
-        <w:tc>
-          <w:tcPr/>
-          <w:p>
-            <w:pPr>
-              <w:pStyle w:val="Compact"/>
-              <w:jc w:val="left"/>
-            </w:pPr>
-            <w:r>
-              <w:rPr>
-                <w:bCs/>
-                <w:b/>
-              </w:rPr>
-              <w:t xml:space="preserve">Channels</w:t>
-            </w:r>
-          </w:p>
-        </w:tc>
-        <w:tc>
-          <w:tcPr/>
-          <w:p>
-            <w:pPr>
-              <w:pStyle w:val="Compact"/>
-              <w:jc w:val="left"/>
-            </w:pPr>
-            <w:r>
-              <w:t xml:space="preserve">Email mailbox, SMS replies, Avaya, WhatsApp/Instagram/Messenger, X. Shows which secrets are set</w:t>
-            </w:r>
-          </w:p>
-        </w:tc>
-      </w:tr>
-      <w:tr>
-        <w:tc>
-          <w:tcPr/>
-          <w:p>
-            <w:pPr>
-              <w:pStyle w:val="Compact"/>
-              <w:jc w:val="left"/>
-            </w:pPr>
-            <w:r>
-              <w:rPr>
-                <w:bCs/>
-                <w:b/>
-              </w:rPr>
-              <w:t xml:space="preserve">Integration hub</w:t>
-            </w:r>
-          </w:p>
-        </w:tc>
-        <w:tc>
-          <w:tcPr/>
-          <w:p>
-            <w:pPr>
-              <w:pStyle w:val="Compact"/>
-              <w:jc w:val="left"/>
-            </w:pPr>
-            <w:r>
-              <w:t xml:space="preserve">API keys and webhooks for other bank systems</w:t>
-            </w:r>
-          </w:p>
-        </w:tc>
-      </w:tr>
-      <w:tr>
-        <w:tc>
-          <w:tcPr/>
-          <w:p>
-            <w:pPr>
-              <w:pStyle w:val="Compact"/>
-              <w:jc w:val="left"/>
-            </w:pPr>
-            <w:r>
-              <w:rPr>
-                <w:bCs/>
-                <w:b/>
-              </w:rPr>
-              <w:t xml:space="preserve">Audit log</w:t>
-            </w:r>
-          </w:p>
-        </w:tc>
-        <w:tc>
-          <w:tcPr/>
-          <w:p>
-            <w:pPr>
-              <w:pStyle w:val="Compact"/>
-              <w:jc w:val="left"/>
-            </w:pPr>
-            <w:r>
-              <w:t xml:space="preserve">Who did what and when</w:t>
-            </w:r>
-          </w:p>
-        </w:tc>
-      </w:tr>
-      <w:tr>
-        <w:tc>
-          <w:tcPr/>
-          <w:p>
-            <w:pPr>
-              <w:pStyle w:val="Compact"/>
-              <w:jc w:val="left"/>
-            </w:pPr>
-            <w:r>
-              <w:rPr>
-                <w:bCs/>
-                <w:b/>
-              </w:rPr>
-              <w:t xml:space="preserve">System health</w:t>
-            </w:r>
-          </w:p>
-        </w:tc>
-        <w:tc>
-          <w:tcPr/>
-          <w:p>
-            <w:pPr>
-              <w:pStyle w:val="Compact"/>
-              <w:jc w:val="left"/>
-            </w:pPr>
-            <w:r>
-              <w:t xml:space="preserve">Job status, queue, errors,</w:t>
+              <w:t xml:space="preserve">Choose the unit</w:t>
             </w:r>
             <w:r>
               <w:t xml:space="preserve"> </w:t>
             </w:r>
             <w:r>
-              <w:rPr>
-                <w:bCs/>
-                <w:b/>
-              </w:rPr>
-              <w:t xml:space="preserve">Speed check</w:t>
-            </w:r>
-            <w:r>
-              <w:t xml:space="preserve">, and the</w:t>
-            </w:r>
-            <w:r>
-              <w:t xml:space="preserve"> </w:t>
-            </w:r>
-            <w:r>
-              <w:rPr>
-                <w:bCs/>
-                <w:b/>
-              </w:rPr>
-              <w:t xml:space="preserve">Before going live</w:t>
-            </w:r>
-            <w:r>
-              <w:t xml:space="preserve"> </w:t>
-            </w:r>
-            <w:r>
-              <w:t xml:space="preserve">list</w:t>
-            </w:r>
-          </w:p>
-        </w:tc>
-      </w:tr>
-      <w:tr>
-        <w:tc>
-          <w:tcPr/>
-          <w:p>
-            <w:pPr>
-              <w:pStyle w:val="Compact"/>
-              <w:jc w:val="left"/>
-            </w:pPr>
-            <w:r>
-              <w:rPr>
-                <w:bCs/>
-                <w:b/>
-              </w:rPr>
-              <w:t xml:space="preserve">Branding</w:t>
-            </w:r>
-          </w:p>
-        </w:tc>
-        <w:tc>
-          <w:tcPr/>
-          <w:p>
-            <w:pPr>
-              <w:pStyle w:val="Compact"/>
-              <w:jc w:val="left"/>
-            </w:pPr>
-            <w:r>
-              <w:t xml:space="preserve">Logo and colours</w:t>
-            </w:r>
-          </w:p>
-        </w:tc>
-      </w:tr>
-      <w:tr>
-        <w:tc>
-          <w:tcPr/>
-          <w:p>
-            <w:pPr>
-              <w:pStyle w:val="Compact"/>
-              <w:jc w:val="left"/>
-            </w:pPr>
-            <w:r>
-              <w:rPr>
-                <w:bCs/>
-                <w:b/>
-              </w:rPr>
-              <w:t xml:space="preserve">Customer summary fields</w:t>
-            </w:r>
-          </w:p>
-        </w:tc>
-        <w:tc>
-          <w:tcPr/>
-          <w:p>
-            <w:pPr>
-              <w:pStyle w:val="Compact"/>
-              <w:jc w:val="left"/>
-            </w:pPr>
-            <w:r>
-              <w:t xml:space="preserve">Which details appear on the customer card</w:t>
+              <w:t xml:space="preserve">so it can be chased.</w:t>
+            </w:r>
+          </w:p>
+        </w:tc>
+      </w:tr>
+      <w:tr>
+        <w:tc>
+          <w:tcPr/>
+          <w:p>
+            <w:pPr>
+              <w:pStyle w:val="Compact"/>
+              <w:jc w:val="left"/>
+            </w:pPr>
+            <w:r>
+              <w:t xml:space="preserve">Resolved</w:t>
+            </w:r>
+          </w:p>
+        </w:tc>
+        <w:tc>
+          <w:tcPr/>
+          <w:p>
+            <w:pPr>
+              <w:pStyle w:val="Compact"/>
+              <w:jc w:val="left"/>
+            </w:pPr>
+            <w:r>
+              <w:t xml:space="preserve">Fixed, awaiting confirmation</w:t>
+            </w:r>
+          </w:p>
+        </w:tc>
+      </w:tr>
+      <w:tr>
+        <w:tc>
+          <w:tcPr/>
+          <w:p>
+            <w:pPr>
+              <w:pStyle w:val="Compact"/>
+              <w:jc w:val="left"/>
+            </w:pPr>
+            <w:r>
+              <w:t xml:space="preserve">Closed</w:t>
+            </w:r>
+          </w:p>
+        </w:tc>
+        <w:tc>
+          <w:tcPr/>
+          <w:p>
+            <w:pPr>
+              <w:pStyle w:val="Compact"/>
+              <w:jc w:val="left"/>
+            </w:pPr>
+            <w:r>
+              <w:t xml:space="preserve">Finished</w:t>
             </w:r>
           </w:p>
         </w:tc>
@@ -2197,30 +1952,391 @@
     </w:tbl>
     <w:p>
       <w:pPr>
-        <w:pStyle w:val="BodyText"/>
-      </w:pPr>
-      <w:r>
-        <w:rPr>
-          <w:bCs/>
-          <w:b/>
-        </w:rPr>
-        <w:t xml:space="preserve">Good habits:</w:t>
-      </w:r>
-      <w:r>
-        <w:t xml:space="preserve"> </w:t>
-      </w:r>
-      <w:r>
-        <w:t xml:space="preserve">keep two administrators; remove or reset demo accounts; check System health daily; never share passwords.</w:t>
-      </w:r>
-    </w:p>
-    <w:bookmarkEnd w:id="30"/>
-    <w:bookmarkStart w:id="31" w:name="questions-and-fixes"/>
+        <w:numPr>
+          <w:ilvl w:val="0"/>
+          <w:numId w:val="1006"/>
+        </w:numPr>
+        <w:pStyle w:val="Compact"/>
+      </w:pPr>
+      <w:r>
+        <w:t xml:space="preserve">Add</w:t>
+      </w:r>
+      <w:r>
+        <w:t xml:space="preserve"> </w:t>
+      </w:r>
+      <w:r>
+        <w:rPr>
+          <w:bCs/>
+          <w:b/>
+        </w:rPr>
+        <w:t xml:space="preserve">comments</w:t>
+      </w:r>
+      <w:r>
+        <w:t xml:space="preserve"> </w:t>
+      </w:r>
+      <w:r>
+        <w:t xml:space="preserve">(internal notes) and</w:t>
+      </w:r>
+      <w:r>
+        <w:t xml:space="preserve"> </w:t>
+      </w:r>
+      <w:r>
+        <w:rPr>
+          <w:bCs/>
+          <w:b/>
+        </w:rPr>
+        <w:t xml:space="preserve">attachments</w:t>
+      </w:r>
+      <w:r>
+        <w:t xml:space="preserve"> </w:t>
+      </w:r>
+      <w:r>
+        <w:t xml:space="preserve">in the case timeline.</w:t>
+      </w:r>
+    </w:p>
+    <w:p>
+      <w:pPr>
+        <w:numPr>
+          <w:ilvl w:val="0"/>
+          <w:numId w:val="1006"/>
+        </w:numPr>
+        <w:pStyle w:val="Compact"/>
+      </w:pPr>
+      <w:r>
+        <w:rPr>
+          <w:bCs/>
+          <w:b/>
+        </w:rPr>
+        <w:t xml:space="preserve">Reuse this ticket</w:t>
+      </w:r>
+      <w:r>
+        <w:t xml:space="preserve"> </w:t>
+      </w:r>
+      <w:r>
+        <w:t xml:space="preserve">(on a closed ticket) is for the same customer coming back with the same complaint. It opens the</w:t>
+      </w:r>
+      <w:r>
+        <w:t xml:space="preserve"> </w:t>
+      </w:r>
+      <w:r>
+        <w:rPr>
+          <w:iCs/>
+          <w:i/>
+        </w:rPr>
+        <w:t xml:space="preserve">Log a new case</w:t>
+      </w:r>
+      <w:r>
+        <w:t xml:space="preserve"> </w:t>
+      </w:r>
+      <w:r>
+        <w:t xml:space="preserve">screen already filled in: the customer, subject, type, priority, case code and description, with the earlier messages shown for reference. Change anything, then save. A</w:t>
+      </w:r>
+      <w:r>
+        <w:t xml:space="preserve"> </w:t>
+      </w:r>
+      <w:r>
+        <w:rPr>
+          <w:bCs/>
+          <w:b/>
+        </w:rPr>
+        <w:t xml:space="preserve">new ticket number</w:t>
+      </w:r>
+      <w:r>
+        <w:t xml:space="preserve"> </w:t>
+      </w:r>
+      <w:r>
+        <w:t xml:space="preserve">is issued, and both tickets get a note pointing at each other.</w:t>
+      </w:r>
+    </w:p>
+    <w:p>
+      <w:pPr>
+        <w:numPr>
+          <w:ilvl w:val="0"/>
+          <w:numId w:val="1006"/>
+        </w:numPr>
+        <w:pStyle w:val="Compact"/>
+      </w:pPr>
+      <w:r>
+        <w:rPr>
+          <w:bCs/>
+          <w:b/>
+        </w:rPr>
+        <w:t xml:space="preserve">Reopen ticket</w:t>
+      </w:r>
+      <w:r>
+        <w:t xml:space="preserve"> </w:t>
+      </w:r>
+      <w:r>
+        <w:t xml:space="preserve">(on a closed ticket) brings back</w:t>
+      </w:r>
+      <w:r>
+        <w:t xml:space="preserve"> </w:t>
+      </w:r>
+      <w:r>
+        <w:rPr>
+          <w:iCs/>
+          <w:i/>
+        </w:rPr>
+        <w:t xml:space="preserve">that exact ticket</w:t>
+      </w:r>
+      <w:r>
+        <w:t xml:space="preserve">, with the same number and history. Use it when a ticket was closed by mistake. The SLA timer starts again from the moment you reopen it, and a reopened ticket does not send SLA emails to line managers or resolved/closed messages to the customer (the SLA colour on screen still works). Once it is open again, the</w:t>
+      </w:r>
+      <w:r>
+        <w:t xml:space="preserve"> </w:t>
+      </w:r>
+      <w:r>
+        <w:rPr>
+          <w:bCs/>
+          <w:b/>
+        </w:rPr>
+        <w:t xml:space="preserve">Escalation</w:t>
+      </w:r>
+      <w:r>
+        <w:t xml:space="preserve"> </w:t>
+      </w:r>
+      <w:r>
+        <w:t xml:space="preserve">box under</w:t>
+      </w:r>
+      <w:r>
+        <w:t xml:space="preserve"> </w:t>
+      </w:r>
+      <w:r>
+        <w:rPr>
+          <w:iCs/>
+          <w:i/>
+        </w:rPr>
+        <w:t xml:space="preserve">Ticket properties</w:t>
+      </w:r>
+      <w:r>
+        <w:t xml:space="preserve"> </w:t>
+      </w:r>
+      <w:r>
+        <w:t xml:space="preserve">lets you escalate it to a unit if needed (the unit is emailed), and you can change the status to Pending with Bank or Pending with 3rd Party.</w:t>
+      </w:r>
+    </w:p>
+    <w:p>
+      <w:pPr>
+        <w:numPr>
+          <w:ilvl w:val="0"/>
+          <w:numId w:val="1006"/>
+        </w:numPr>
+        <w:pStyle w:val="Compact"/>
+      </w:pPr>
+      <w:r>
+        <w:rPr>
+          <w:bCs/>
+          <w:b/>
+        </w:rPr>
+        <w:t xml:space="preserve">SLA colours:</w:t>
+      </w:r>
+      <w:r>
+        <w:t xml:space="preserve"> </w:t>
+      </w:r>
+      <w:r>
+        <w:t xml:space="preserve">green on track, amber close to the limit, red breached. Work red first.</w:t>
+      </w:r>
+    </w:p>
+    <w:bookmarkEnd w:id="26"/>
+    <w:bookmarkStart w:id="27" w:name="the-customer-page"/>
+    <w:p>
+      <w:pPr>
+        <w:pStyle w:val="Heading2"/>
+      </w:pPr>
+      <w:r>
+        <w:t xml:space="preserve">4.5 The customer page</w:t>
+      </w:r>
+    </w:p>
+    <w:p>
+      <w:pPr>
+        <w:pStyle w:val="FirstParagraph"/>
+      </w:pPr>
+      <w:r>
+        <w:t xml:space="preserve">Shows profile, cases, all messages across channels, accounts, feedback, and a</w:t>
+      </w:r>
+      <w:r>
+        <w:t xml:space="preserve"> </w:t>
+      </w:r>
+      <w:r>
+        <w:rPr>
+          <w:bCs/>
+          <w:b/>
+        </w:rPr>
+        <w:t xml:space="preserve">live core-banking card</w:t>
+      </w:r>
+      <w:r>
+        <w:t xml:space="preserve"> </w:t>
+      </w:r>
+      <w:r>
+        <w:t xml:space="preserve">with balance and recent transactions (when connected). Use it to verify and answer without switching systems.</w:t>
+      </w:r>
+    </w:p>
+    <w:bookmarkEnd w:id="27"/>
+    <w:bookmarkEnd w:id="28"/>
+    <w:bookmarkStart w:id="29" w:name="supervisors"/>
     <w:p>
       <w:pPr>
         <w:pStyle w:val="Heading1"/>
       </w:pPr>
       <w:r>
-        <w:t xml:space="preserve">7. Questions and fixes</w:t>
+        <w:t xml:space="preserve">5. Supervisors</w:t>
+      </w:r>
+    </w:p>
+    <w:p>
+      <w:pPr>
+        <w:numPr>
+          <w:ilvl w:val="0"/>
+          <w:numId w:val="1007"/>
+        </w:numPr>
+        <w:pStyle w:val="Compact"/>
+      </w:pPr>
+      <w:r>
+        <w:rPr>
+          <w:bCs/>
+          <w:b/>
+        </w:rPr>
+        <w:t xml:space="preserve">Cases:</w:t>
+      </w:r>
+      <w:r>
+        <w:t xml:space="preserve"> </w:t>
+      </w:r>
+      <w:r>
+        <w:t xml:space="preserve">tabs show scopes (for example mine, my team, all, overdue). Use filters for status, priority, date, agent.</w:t>
+      </w:r>
+    </w:p>
+    <w:p>
+      <w:pPr>
+        <w:numPr>
+          <w:ilvl w:val="0"/>
+          <w:numId w:val="1007"/>
+        </w:numPr>
+        <w:pStyle w:val="Compact"/>
+      </w:pPr>
+      <w:r>
+        <w:rPr>
+          <w:bCs/>
+          <w:b/>
+        </w:rPr>
+        <w:t xml:space="preserve">Export:</w:t>
+      </w:r>
+      <w:r>
+        <w:t xml:space="preserve"> </w:t>
+      </w:r>
+      <w:r>
+        <w:t xml:space="preserve">download to Excel, up to 92 days at a time.</w:t>
+      </w:r>
+    </w:p>
+    <w:p>
+      <w:pPr>
+        <w:numPr>
+          <w:ilvl w:val="0"/>
+          <w:numId w:val="1007"/>
+        </w:numPr>
+        <w:pStyle w:val="Compact"/>
+      </w:pPr>
+      <w:r>
+        <w:rPr>
+          <w:bCs/>
+          <w:b/>
+        </w:rPr>
+        <w:t xml:space="preserve">Batch close:</w:t>
+      </w:r>
+      <w:r>
+        <w:t xml:space="preserve"> </w:t>
+      </w:r>
+      <w:r>
+        <w:t xml:space="preserve">tick several cases and close them together.</w:t>
+      </w:r>
+    </w:p>
+    <w:p>
+      <w:pPr>
+        <w:numPr>
+          <w:ilvl w:val="0"/>
+          <w:numId w:val="1007"/>
+        </w:numPr>
+        <w:pStyle w:val="Compact"/>
+      </w:pPr>
+      <w:r>
+        <w:rPr>
+          <w:bCs/>
+          <w:b/>
+        </w:rPr>
+        <w:t xml:space="preserve">Quality review:</w:t>
+      </w:r>
+      <w:r>
+        <w:t xml:space="preserve"> </w:t>
+      </w:r>
+      <w:r>
+        <w:t xml:space="preserve">open a case → QA panel → score it and leave coaching notes for the agent.</w:t>
+      </w:r>
+    </w:p>
+    <w:p>
+      <w:pPr>
+        <w:numPr>
+          <w:ilvl w:val="0"/>
+          <w:numId w:val="1007"/>
+        </w:numPr>
+        <w:pStyle w:val="Compact"/>
+      </w:pPr>
+      <w:r>
+        <w:rPr>
+          <w:bCs/>
+          <w:b/>
+        </w:rPr>
+        <w:t xml:space="preserve">Analytics:</w:t>
+      </w:r>
+      <w:r>
+        <w:t xml:space="preserve"> </w:t>
+      </w:r>
+      <w:r>
+        <w:t xml:space="preserve">volume, SLA, resolution time, agent results, and the</w:t>
+      </w:r>
+      <w:r>
+        <w:t xml:space="preserve"> </w:t>
+      </w:r>
+      <w:r>
+        <w:rPr>
+          <w:bCs/>
+          <w:b/>
+        </w:rPr>
+        <w:t xml:space="preserve">Channels</w:t>
+      </w:r>
+      <w:r>
+        <w:t xml:space="preserve"> </w:t>
+      </w:r>
+      <w:r>
+        <w:t xml:space="preserve">section: volume per channel, average response time per channel, and missed calls nobody returned.</w:t>
+      </w:r>
+    </w:p>
+    <w:bookmarkEnd w:id="29"/>
+    <w:bookmarkStart w:id="30" w:name="administrators"/>
+    <w:p>
+      <w:pPr>
+        <w:pStyle w:val="Heading1"/>
+      </w:pPr>
+      <w:r>
+        <w:t xml:space="preserve">6. Administrators</w:t>
+      </w:r>
+    </w:p>
+    <w:p>
+      <w:pPr>
+        <w:pStyle w:val="FirstParagraph"/>
+      </w:pPr>
+      <w:r>
+        <w:t xml:space="preserve">All under</w:t>
+      </w:r>
+      <w:r>
+        <w:t xml:space="preserve"> </w:t>
+      </w:r>
+      <w:r>
+        <w:rPr>
+          <w:bCs/>
+          <w:b/>
+        </w:rPr>
+        <w:t xml:space="preserve">Admin</w:t>
+      </w:r>
+      <w:r>
+        <w:t xml:space="preserve">.</w:t>
       </w:r>
     </w:p>
     <w:tbl>
@@ -2246,6 +2362,524 @@
               <w:jc w:val="left"/>
             </w:pPr>
             <w:r>
+              <w:t xml:space="preserve">Setting</w:t>
+            </w:r>
+          </w:p>
+        </w:tc>
+        <w:tc>
+          <w:tcPr/>
+          <w:p>
+            <w:pPr>
+              <w:pStyle w:val="Compact"/>
+              <w:jc w:val="left"/>
+            </w:pPr>
+            <w:r>
+              <w:t xml:space="preserve">What it does</w:t>
+            </w:r>
+          </w:p>
+        </w:tc>
+      </w:tr>
+      <w:tr>
+        <w:tc>
+          <w:tcPr/>
+          <w:p>
+            <w:pPr>
+              <w:pStyle w:val="Compact"/>
+              <w:jc w:val="left"/>
+            </w:pPr>
+            <w:r>
+              <w:rPr>
+                <w:bCs/>
+                <w:b/>
+              </w:rPr>
+              <w:t xml:space="preserve">Users &amp; roles</w:t>
+            </w:r>
+          </w:p>
+        </w:tc>
+        <w:tc>
+          <w:tcPr/>
+          <w:p>
+            <w:pPr>
+              <w:pStyle w:val="Compact"/>
+              <w:jc w:val="left"/>
+            </w:pPr>
+            <w:r>
+              <w:t xml:space="preserve">Add users (temporary password shown once), change roles, deactivate, reset password</w:t>
+            </w:r>
+          </w:p>
+        </w:tc>
+      </w:tr>
+      <w:tr>
+        <w:tc>
+          <w:tcPr/>
+          <w:p>
+            <w:pPr>
+              <w:pStyle w:val="Compact"/>
+              <w:jc w:val="left"/>
+            </w:pPr>
+            <w:r>
+              <w:rPr>
+                <w:bCs/>
+                <w:b/>
+              </w:rPr>
+              <w:t xml:space="preserve">Departments</w:t>
+            </w:r>
+          </w:p>
+        </w:tc>
+        <w:tc>
+          <w:tcPr/>
+          <w:p>
+            <w:pPr>
+              <w:pStyle w:val="Compact"/>
+              <w:jc w:val="left"/>
+            </w:pPr>
+            <w:r>
+              <w:t xml:space="preserve">Teams and units</w:t>
+            </w:r>
+          </w:p>
+        </w:tc>
+      </w:tr>
+      <w:tr>
+        <w:tc>
+          <w:tcPr/>
+          <w:p>
+            <w:pPr>
+              <w:pStyle w:val="Compact"/>
+              <w:jc w:val="left"/>
+            </w:pPr>
+            <w:r>
+              <w:rPr>
+                <w:bCs/>
+                <w:b/>
+              </w:rPr>
+              <w:t xml:space="preserve">Case codes</w:t>
+            </w:r>
+          </w:p>
+        </w:tc>
+        <w:tc>
+          <w:tcPr/>
+          <w:p>
+            <w:pPr>
+              <w:pStyle w:val="Compact"/>
+              <w:jc w:val="left"/>
+            </w:pPr>
+            <w:r>
+              <w:t xml:space="preserve">Categories, default priority and SLA</w:t>
+            </w:r>
+          </w:p>
+        </w:tc>
+      </w:tr>
+      <w:tr>
+        <w:tc>
+          <w:tcPr/>
+          <w:p>
+            <w:pPr>
+              <w:pStyle w:val="Compact"/>
+              <w:jc w:val="left"/>
+            </w:pPr>
+            <w:r>
+              <w:rPr>
+                <w:bCs/>
+                <w:b/>
+              </w:rPr>
+              <w:t xml:space="preserve">SLA policies</w:t>
+            </w:r>
+          </w:p>
+        </w:tc>
+        <w:tc>
+          <w:tcPr/>
+          <w:p>
+            <w:pPr>
+              <w:pStyle w:val="Compact"/>
+              <w:jc w:val="left"/>
+            </w:pPr>
+            <w:r>
+              <w:t xml:space="preserve">Time limits per priority</w:t>
+            </w:r>
+          </w:p>
+        </w:tc>
+      </w:tr>
+      <w:tr>
+        <w:tc>
+          <w:tcPr/>
+          <w:p>
+            <w:pPr>
+              <w:pStyle w:val="Compact"/>
+              <w:jc w:val="left"/>
+            </w:pPr>
+            <w:r>
+              <w:rPr>
+                <w:bCs/>
+                <w:b/>
+              </w:rPr>
+              <w:t xml:space="preserve">Business hours</w:t>
+            </w:r>
+          </w:p>
+        </w:tc>
+        <w:tc>
+          <w:tcPr/>
+          <w:p>
+            <w:pPr>
+              <w:pStyle w:val="Compact"/>
+              <w:jc w:val="left"/>
+            </w:pPr>
+            <w:r>
+              <w:t xml:space="preserve">Working hours and holidays for SLA counting</w:t>
+            </w:r>
+          </w:p>
+        </w:tc>
+      </w:tr>
+      <w:tr>
+        <w:tc>
+          <w:tcPr/>
+          <w:p>
+            <w:pPr>
+              <w:pStyle w:val="Compact"/>
+              <w:jc w:val="left"/>
+            </w:pPr>
+            <w:r>
+              <w:rPr>
+                <w:bCs/>
+                <w:b/>
+              </w:rPr>
+              <w:t xml:space="preserve">SLA escalation</w:t>
+            </w:r>
+          </w:p>
+        </w:tc>
+        <w:tc>
+          <w:tcPr/>
+          <w:p>
+            <w:pPr>
+              <w:pStyle w:val="Compact"/>
+              <w:jc w:val="left"/>
+            </w:pPr>
+            <w:r>
+              <w:t xml:space="preserve">Who is alerted at what point</w:t>
+            </w:r>
+          </w:p>
+        </w:tc>
+      </w:tr>
+      <w:tr>
+        <w:tc>
+          <w:tcPr/>
+          <w:p>
+            <w:pPr>
+              <w:pStyle w:val="Compact"/>
+              <w:jc w:val="left"/>
+            </w:pPr>
+            <w:r>
+              <w:rPr>
+                <w:bCs/>
+                <w:b/>
+              </w:rPr>
+              <w:t xml:space="preserve">Notification centre</w:t>
+            </w:r>
+          </w:p>
+        </w:tc>
+        <w:tc>
+          <w:tcPr/>
+          <w:p>
+            <w:pPr>
+              <w:pStyle w:val="Compact"/>
+              <w:jc w:val="left"/>
+            </w:pPr>
+            <w:r>
+              <w:t xml:space="preserve">Email and SMS gateways, message templates, tests</w:t>
+            </w:r>
+          </w:p>
+        </w:tc>
+      </w:tr>
+      <w:tr>
+        <w:tc>
+          <w:tcPr/>
+          <w:p>
+            <w:pPr>
+              <w:pStyle w:val="Compact"/>
+              <w:jc w:val="left"/>
+            </w:pPr>
+            <w:r>
+              <w:rPr>
+                <w:bCs/>
+                <w:b/>
+              </w:rPr>
+              <w:t xml:space="preserve">Core banking</w:t>
+            </w:r>
+          </w:p>
+        </w:tc>
+        <w:tc>
+          <w:tcPr/>
+          <w:p>
+            <w:pPr>
+              <w:pStyle w:val="Compact"/>
+              <w:jc w:val="left"/>
+            </w:pPr>
+            <w:r>
+              <w:t xml:space="preserve">Connects live balance and transactions</w:t>
+            </w:r>
+          </w:p>
+        </w:tc>
+      </w:tr>
+      <w:tr>
+        <w:tc>
+          <w:tcPr/>
+          <w:p>
+            <w:pPr>
+              <w:pStyle w:val="Compact"/>
+              <w:jc w:val="left"/>
+            </w:pPr>
+            <w:r>
+              <w:rPr>
+                <w:bCs/>
+                <w:b/>
+              </w:rPr>
+              <w:t xml:space="preserve">Channels</w:t>
+            </w:r>
+          </w:p>
+        </w:tc>
+        <w:tc>
+          <w:tcPr/>
+          <w:p>
+            <w:pPr>
+              <w:pStyle w:val="Compact"/>
+              <w:jc w:val="left"/>
+            </w:pPr>
+            <w:r>
+              <w:t xml:space="preserve">Email mailbox, SMS replies, Avaya, WhatsApp/Instagram/Messenger, X. Shows which secrets are set</w:t>
+            </w:r>
+          </w:p>
+        </w:tc>
+      </w:tr>
+      <w:tr>
+        <w:tc>
+          <w:tcPr/>
+          <w:p>
+            <w:pPr>
+              <w:pStyle w:val="Compact"/>
+              <w:jc w:val="left"/>
+            </w:pPr>
+            <w:r>
+              <w:rPr>
+                <w:bCs/>
+                <w:b/>
+              </w:rPr>
+              <w:t xml:space="preserve">Integration hub</w:t>
+            </w:r>
+          </w:p>
+        </w:tc>
+        <w:tc>
+          <w:tcPr/>
+          <w:p>
+            <w:pPr>
+              <w:pStyle w:val="Compact"/>
+              <w:jc w:val="left"/>
+            </w:pPr>
+            <w:r>
+              <w:t xml:space="preserve">API keys and webhooks for other bank systems</w:t>
+            </w:r>
+          </w:p>
+        </w:tc>
+      </w:tr>
+      <w:tr>
+        <w:tc>
+          <w:tcPr/>
+          <w:p>
+            <w:pPr>
+              <w:pStyle w:val="Compact"/>
+              <w:jc w:val="left"/>
+            </w:pPr>
+            <w:r>
+              <w:rPr>
+                <w:bCs/>
+                <w:b/>
+              </w:rPr>
+              <w:t xml:space="preserve">Audit log</w:t>
+            </w:r>
+          </w:p>
+        </w:tc>
+        <w:tc>
+          <w:tcPr/>
+          <w:p>
+            <w:pPr>
+              <w:pStyle w:val="Compact"/>
+              <w:jc w:val="left"/>
+            </w:pPr>
+            <w:r>
+              <w:t xml:space="preserve">Who did what and when</w:t>
+            </w:r>
+          </w:p>
+        </w:tc>
+      </w:tr>
+      <w:tr>
+        <w:tc>
+          <w:tcPr/>
+          <w:p>
+            <w:pPr>
+              <w:pStyle w:val="Compact"/>
+              <w:jc w:val="left"/>
+            </w:pPr>
+            <w:r>
+              <w:rPr>
+                <w:bCs/>
+                <w:b/>
+              </w:rPr>
+              <w:t xml:space="preserve">System health</w:t>
+            </w:r>
+          </w:p>
+        </w:tc>
+        <w:tc>
+          <w:tcPr/>
+          <w:p>
+            <w:pPr>
+              <w:pStyle w:val="Compact"/>
+              <w:jc w:val="left"/>
+            </w:pPr>
+            <w:r>
+              <w:t xml:space="preserve">Job status, queue, errors,</w:t>
+            </w:r>
+            <w:r>
+              <w:t xml:space="preserve"> </w:t>
+            </w:r>
+            <w:r>
+              <w:rPr>
+                <w:bCs/>
+                <w:b/>
+              </w:rPr>
+              <w:t xml:space="preserve">Speed check</w:t>
+            </w:r>
+            <w:r>
+              <w:t xml:space="preserve">, and the</w:t>
+            </w:r>
+            <w:r>
+              <w:t xml:space="preserve"> </w:t>
+            </w:r>
+            <w:r>
+              <w:rPr>
+                <w:bCs/>
+                <w:b/>
+              </w:rPr>
+              <w:t xml:space="preserve">Before going live</w:t>
+            </w:r>
+            <w:r>
+              <w:t xml:space="preserve"> </w:t>
+            </w:r>
+            <w:r>
+              <w:t xml:space="preserve">list</w:t>
+            </w:r>
+          </w:p>
+        </w:tc>
+      </w:tr>
+      <w:tr>
+        <w:tc>
+          <w:tcPr/>
+          <w:p>
+            <w:pPr>
+              <w:pStyle w:val="Compact"/>
+              <w:jc w:val="left"/>
+            </w:pPr>
+            <w:r>
+              <w:rPr>
+                <w:bCs/>
+                <w:b/>
+              </w:rPr>
+              <w:t xml:space="preserve">Branding</w:t>
+            </w:r>
+          </w:p>
+        </w:tc>
+        <w:tc>
+          <w:tcPr/>
+          <w:p>
+            <w:pPr>
+              <w:pStyle w:val="Compact"/>
+              <w:jc w:val="left"/>
+            </w:pPr>
+            <w:r>
+              <w:t xml:space="preserve">Logo and colours</w:t>
+            </w:r>
+          </w:p>
+        </w:tc>
+      </w:tr>
+      <w:tr>
+        <w:tc>
+          <w:tcPr/>
+          <w:p>
+            <w:pPr>
+              <w:pStyle w:val="Compact"/>
+              <w:jc w:val="left"/>
+            </w:pPr>
+            <w:r>
+              <w:rPr>
+                <w:bCs/>
+                <w:b/>
+              </w:rPr>
+              <w:t xml:space="preserve">Customer summary fields</w:t>
+            </w:r>
+          </w:p>
+        </w:tc>
+        <w:tc>
+          <w:tcPr/>
+          <w:p>
+            <w:pPr>
+              <w:pStyle w:val="Compact"/>
+              <w:jc w:val="left"/>
+            </w:pPr>
+            <w:r>
+              <w:t xml:space="preserve">Which details appear on the customer card</w:t>
+            </w:r>
+          </w:p>
+        </w:tc>
+      </w:tr>
+    </w:tbl>
+    <w:p>
+      <w:pPr>
+        <w:pStyle w:val="BodyText"/>
+      </w:pPr>
+      <w:r>
+        <w:rPr>
+          <w:bCs/>
+          <w:b/>
+        </w:rPr>
+        <w:t xml:space="preserve">Good habits:</w:t>
+      </w:r>
+      <w:r>
+        <w:t xml:space="preserve"> </w:t>
+      </w:r>
+      <w:r>
+        <w:t xml:space="preserve">keep two administrators; remove or reset demo accounts; check System health daily; never share passwords.</w:t>
+      </w:r>
+    </w:p>
+    <w:bookmarkEnd w:id="30"/>
+    <w:bookmarkStart w:id="31" w:name="questions-and-fixes"/>
+    <w:p>
+      <w:pPr>
+        <w:pStyle w:val="Heading1"/>
+      </w:pPr>
+      <w:r>
+        <w:t xml:space="preserve">7. Questions and fixes</w:t>
+      </w:r>
+    </w:p>
+    <w:tbl>
+      <w:tblPr>
+        <w:tblStyle w:val="Table"/>
+        <w:tblW w:type="pct" w:w="5000"/>
+        <w:tblLook w:firstRow="1" w:lastRow="0" w:firstColumn="0" w:lastColumn="0" w:noHBand="0" w:noVBand="0" w:val="0020"/>
+        <w:jc w:val="start"/>
+      </w:tblPr>
+      <w:tblGrid>
+        <w:gridCol w:w="3960"/>
+        <w:gridCol w:w="3960"/>
+      </w:tblGrid>
+      <w:tr>
+        <w:trPr>
+          <w:tblHeader w:val="true"/>
+        </w:trPr>
+        <w:tc>
+          <w:tcPr/>
+          <w:p>
+            <w:pPr>
+              <w:pStyle w:val="Compact"/>
+              <w:jc w:val="left"/>
+            </w:pPr>
+            <w:r>
               <w:t xml:space="preserve">Problem</w:t>
             </w:r>
           </w:p>
@@ -2555,7 +3189,7 @@
       </w:r>
     </w:p>
     <w:bookmarkEnd w:id="32"/>
-    <w:bookmarkStart w:id="33" w:name="one-page-quick-reference"/>
+    <w:bookmarkStart w:id="35" w:name="one-page-quick-reference"/>
     <w:p>
       <w:pPr>
         <w:pStyle w:val="Heading1"/>
@@ -2688,7 +3322,289 @@
         <w:t xml:space="preserve">End of day: nothing left in Inbox, no red cases unassigned.</w:t>
       </w:r>
     </w:p>
+    <w:bookmarkStart w:id="33" w:name="Xaef2acd558d3120f570866fc0277a17fc7514e7"/>
+    <w:p>
+      <w:pPr>
+        <w:pStyle w:val="Heading2"/>
+      </w:pPr>
+      <w:r>
+        <w:t xml:space="preserve">Email signature, auto-replies and customer identifiers</w:t>
+      </w:r>
+    </w:p>
+    <w:p>
+      <w:pPr>
+        <w:pStyle w:val="FirstParagraph"/>
+      </w:pPr>
+      <w:r>
+        <w:rPr>
+          <w:bCs/>
+          <w:b/>
+        </w:rPr>
+        <w:t xml:space="preserve">Email signature (Admin → Messages &amp; signature).</w:t>
+      </w:r>
+      <w:r>
+        <w:t xml:space="preserve"> </w:t>
+      </w:r>
+      <w:r>
+        <w:t xml:space="preserve">Every email an agent sends from the Inbox carries:</w:t>
+      </w:r>
+      <w:r>
+        <w:t xml:space="preserve"> </w:t>
+      </w:r>
+      <w:r>
+        <w:t xml:space="preserve">“</w:t>
+      </w:r>
+      <w:r>
+        <w:t xml:space="preserve">Thank you for choosing PremiumTrust Bank / Please reply via the same mail trail / Regards,</w:t>
+      </w:r>
+      <w:r>
+        <w:t xml:space="preserve"> </w:t>
+      </w:r>
+      <w:r>
+        <w:rPr>
+          <w:iCs/>
+          <w:i/>
+        </w:rPr>
+        <w:t xml:space="preserve">agent name</w:t>
+      </w:r>
+      <w:r>
+        <w:t xml:space="preserve">”</w:t>
+      </w:r>
+      <w:r>
+        <w:t xml:space="preserve"> </w:t>
+      </w:r>
+      <w:r>
+        <w:t xml:space="preserve">and a clickable survey link. Set the bank name and paste the SurveyMonkey link there; a preview shows exactly what customers see. Leave the link blank to send without one.</w:t>
+      </w:r>
+    </w:p>
+    <w:p>
+      <w:pPr>
+        <w:pStyle w:val="BodyText"/>
+      </w:pPr>
+      <w:r>
+        <w:rPr>
+          <w:bCs/>
+          <w:b/>
+        </w:rPr>
+        <w:t xml:space="preserve">Automatic replies.</w:t>
+      </w:r>
+      <w:r>
+        <w:t xml:space="preserve"> </w:t>
+      </w:r>
+      <w:r>
+        <w:t xml:space="preserve">On the same page, switch on an automatic reply per channel (Email, WhatsApp, SMS, Instagram, Facebook, X, and an SMS for missed phone calls) and edit the wording. A customer gets at most one automatic reply every few hours (default 6; you can change it), so five quick messages don’t produce five replies. Auto-replies show as</w:t>
+      </w:r>
+      <w:r>
+        <w:t xml:space="preserve"> </w:t>
+      </w:r>
+      <w:r>
+        <w:t xml:space="preserve">“</w:t>
+      </w:r>
+      <w:r>
+        <w:t xml:space="preserve">Auto-reply</w:t>
+      </w:r>
+      <w:r>
+        <w:t xml:space="preserve">”</w:t>
+      </w:r>
+      <w:r>
+        <w:t xml:space="preserve"> </w:t>
+      </w:r>
+      <w:r>
+        <w:t xml:space="preserve">in the conversation and are not counted as an agent’s response in reports. They only go out when the channel is connected.</w:t>
+      </w:r>
+    </w:p>
+    <w:p>
+      <w:pPr>
+        <w:pStyle w:val="BodyText"/>
+      </w:pPr>
+      <w:r>
+        <w:rPr>
+          <w:bCs/>
+          <w:b/>
+        </w:rPr>
+        <w:t xml:space="preserve">Email works like a mail client.</w:t>
+      </w:r>
+      <w:r>
+        <w:t xml:space="preserve"> </w:t>
+      </w:r>
+      <w:r>
+        <w:t xml:space="preserve">Open an email in the Inbox to see it as mail (From/To, time, message), with a Subject line and a larger reply box. The envelope button beside the search box starts a</w:t>
+      </w:r>
+      <w:r>
+        <w:t xml:space="preserve"> </w:t>
+      </w:r>
+      <w:r>
+        <w:rPr>
+          <w:bCs/>
+          <w:b/>
+        </w:rPr>
+        <w:t xml:space="preserve">New email</w:t>
+      </w:r>
+      <w:r>
+        <w:t xml:space="preserve"> </w:t>
+      </w:r>
+      <w:r>
+        <w:t xml:space="preserve">to any address.</w:t>
+      </w:r>
+    </w:p>
+    <w:p>
+      <w:pPr>
+        <w:pStyle w:val="BodyText"/>
+      </w:pPr>
+      <w:r>
+        <w:rPr>
+          <w:bCs/>
+          <w:b/>
+        </w:rPr>
+        <w:t xml:space="preserve">Identifiers.</w:t>
+      </w:r>
+      <w:r>
+        <w:t xml:space="preserve"> </w:t>
+      </w:r>
+      <w:r>
+        <w:t xml:space="preserve">Each conversation shows how the customer reached you: phone number (WhatsApp, SMS, calls), email, or social handle. Instagram, X and Facebook only give a platform ID, so click</w:t>
+      </w:r>
+      <w:r>
+        <w:t xml:space="preserve"> </w:t>
+      </w:r>
+      <w:r>
+        <w:t xml:space="preserve">“</w:t>
+      </w:r>
+      <w:r>
+        <w:t xml:space="preserve">+ Add handle</w:t>
+      </w:r>
+      <w:r>
+        <w:t xml:space="preserve">”</w:t>
+      </w:r>
+      <w:r>
+        <w:t xml:space="preserve"> </w:t>
+      </w:r>
+      <w:r>
+        <w:t xml:space="preserve">once to type it; it then shows on every conversation and on the ticket. Facebook is the former</w:t>
+      </w:r>
+      <w:r>
+        <w:t xml:space="preserve"> </w:t>
+      </w:r>
+      <w:r>
+        <w:t xml:space="preserve">“</w:t>
+      </w:r>
+      <w:r>
+        <w:t xml:space="preserve">Messenger</w:t>
+      </w:r>
+      <w:r>
+        <w:t xml:space="preserve">”</w:t>
+      </w:r>
+      <w:r>
+        <w:t xml:space="preserve"> </w:t>
+      </w:r>
+      <w:r>
+        <w:t xml:space="preserve">channel; unused Portal, Web chat and Other social tiles are hidden until they receive something.</w:t>
+      </w:r>
+    </w:p>
+    <w:p>
+      <w:pPr>
+        <w:pStyle w:val="BodyText"/>
+      </w:pPr>
+      <w:r>
+        <w:rPr>
+          <w:bCs/>
+          <w:b/>
+        </w:rPr>
+        <w:t xml:space="preserve">Registered line.</w:t>
+      </w:r>
+      <w:r>
+        <w:t xml:space="preserve"> </w:t>
+      </w:r>
+      <w:r>
+        <w:t xml:space="preserve">When logging a ticket (new ticket or from the Inbox), tick whether the customer is using their registered line/email. If not, type the number or email they used. It is for the record and shows on the ticket’s customer card.</w:t>
+      </w:r>
+    </w:p>
     <w:bookmarkEnd w:id="33"/>
+    <w:bookmarkStart w:id="34" w:name="email-attachments-and-the-email-queue"/>
+    <w:p>
+      <w:pPr>
+        <w:pStyle w:val="Heading2"/>
+      </w:pPr>
+      <w:r>
+        <w:t xml:space="preserve">Email attachments and the email queue</w:t>
+      </w:r>
+    </w:p>
+    <w:p>
+      <w:pPr>
+        <w:pStyle w:val="FirstParagraph"/>
+      </w:pPr>
+      <w:r>
+        <w:t xml:space="preserve">In</w:t>
+      </w:r>
+      <w:r>
+        <w:t xml:space="preserve"> </w:t>
+      </w:r>
+      <w:r>
+        <w:rPr>
+          <w:bCs/>
+          <w:b/>
+        </w:rPr>
+        <w:t xml:space="preserve">New email</w:t>
+      </w:r>
+      <w:r>
+        <w:t xml:space="preserve"> </w:t>
+      </w:r>
+      <w:r>
+        <w:t xml:space="preserve">and in an email reply, use</w:t>
+      </w:r>
+      <w:r>
+        <w:t xml:space="preserve"> </w:t>
+      </w:r>
+      <w:r>
+        <w:rPr>
+          <w:bCs/>
+          <w:b/>
+        </w:rPr>
+        <w:t xml:space="preserve">Attach</w:t>
+      </w:r>
+      <w:r>
+        <w:t xml:space="preserve"> </w:t>
+      </w:r>
+      <w:r>
+        <w:t xml:space="preserve">to add up to 3 files (3 MB each, 4 MB in total). Programs and scripts (.exe, .bat, .js and similar) are blocked. Attachments need the Microsoft 365 email connection. Files are stored securely in CX360, go out with the email through the normal queue (failed sends retry automatically), and are removed after 30 days. The Integration hub’s</w:t>
+      </w:r>
+      <w:r>
+        <w:t xml:space="preserve"> </w:t>
+      </w:r>
+      <w:r>
+        <w:t xml:space="preserve">“</w:t>
+      </w:r>
+      <w:r>
+        <w:t xml:space="preserve">Things to look at</w:t>
+      </w:r>
+      <w:r>
+        <w:t xml:space="preserve">”</w:t>
+      </w:r>
+      <w:r>
+        <w:t xml:space="preserve"> </w:t>
+      </w:r>
+      <w:r>
+        <w:t xml:space="preserve">shows how many emails are waiting or failed, and whether attachments are on. Attachments on emails</w:t>
+      </w:r>
+      <w:r>
+        <w:t xml:space="preserve"> </w:t>
+      </w:r>
+      <w:r>
+        <w:rPr>
+          <w:iCs/>
+          <w:i/>
+        </w:rPr>
+        <w:t xml:space="preserve">received</w:t>
+      </w:r>
+      <w:r>
+        <w:t xml:space="preserve"> </w:t>
+      </w:r>
+      <w:r>
+        <w:t xml:space="preserve">from customers are not saved yet.</w:t>
+      </w:r>
+    </w:p>
+    <w:bookmarkEnd w:id="34"/>
+    <w:bookmarkEnd w:id="35"/>
     <w:sectPr/>
   </w:body>
 </w:document>

</xml_diff>